<commit_message>
docs(agents): checklist d'activation (parité V2, cache, streaming, sources réelles)
</commit_message>
<xml_diff>
--- a/docs/Documentation_Socle_Agentique_V3.docx
+++ b/docs/Documentation_Socle_Agentique_V3.docx
@@ -3671,6 +3671,166 @@
           <w:sz w:val="22"/>
         </w:rPr>
         <w:t>format + check ; les imports triés ; aucune exception trop large non justifiée.</w:t>
+      </w:r>
+    </w:p>
+    <w:p>
+      <w:r>
+        <w:br w:type="page"/>
+      </w:r>
+    </w:p>
+    <w:p>
+      <w:pPr>
+        <w:pStyle w:val="Heading1"/>
+      </w:pPr>
+      <w:r>
+        <w:rPr>
+          <w:color w:val="EA5B13"/>
+        </w:rPr>
+        <w:t>Checklist d'activation (avant agents_enabled = ON)</w:t>
+      </w:r>
+    </w:p>
+    <w:p>
+      <w:pPr>
+        <w:spacing w:after="120"/>
+      </w:pPr>
+      <w:r>
+        <w:rPr>
+          <w:b w:val="0"/>
+          <w:i w:val="0"/>
+          <w:color w:val="1F1F1F"/>
+          <w:sz w:val="22"/>
+        </w:rPr>
+        <w:t>Le socle est sûr et dormant (flag OFF, V2 inchangée). Mais l'activer en l'état dégraderait l'expérience par rapport à la V2 : le chemin agentique n'a pas encore la parité fonctionnelle. À traiter avant tout rollout (revue adversariale du 29/06/2026) :</w:t>
+      </w:r>
+    </w:p>
+    <w:p>
+      <w:pPr>
+        <w:pStyle w:val="ListBullet"/>
+      </w:pPr>
+      <w:r>
+        <w:rPr>
+          <w:b/>
+          <w:i w:val="0"/>
+          <w:color w:val="EA5B13"/>
+          <w:sz w:val="22"/>
+        </w:rPr>
+        <w:t xml:space="preserve">Parité features V2 — </w:t>
+      </w:r>
+      <w:r>
+        <w:rPr>
+          <w:b w:val="0"/>
+          <w:i w:val="0"/>
+          <w:color w:val="1F1F1F"/>
+          <w:sz w:val="22"/>
+        </w:rPr>
+        <w:t>l'orchestrateur ne fait pas encore l'enrichissement contact ANADER ni la clarification consultative que la V2 applique. Un agent ne doit pas faire disparaître ces features validées.</w:t>
+      </w:r>
+    </w:p>
+    <w:p>
+      <w:pPr>
+        <w:pStyle w:val="ListBullet"/>
+      </w:pPr>
+      <w:r>
+        <w:rPr>
+          <w:b/>
+          <w:i w:val="0"/>
+          <w:color w:val="EA5B13"/>
+          <w:sz w:val="22"/>
+        </w:rPr>
+        <w:t xml:space="preserve">Cache de réponses — </w:t>
+      </w:r>
+      <w:r>
+        <w:rPr>
+          <w:b w:val="0"/>
+          <w:i w:val="0"/>
+          <w:color w:val="1F1F1F"/>
+          <w:sz w:val="22"/>
+        </w:rPr>
+        <w:t>l'orchestrateur n'utilise le cache que pour le rate-limit. Brancher get_cached/set_cached (et le préchauffage), sinon chaque tour relance l'inférence (~38 s CPU).</w:t>
+      </w:r>
+    </w:p>
+    <w:p>
+      <w:pPr>
+        <w:pStyle w:val="ListBullet"/>
+      </w:pPr>
+      <w:r>
+        <w:rPr>
+          <w:b/>
+          <w:i w:val="0"/>
+          <w:color w:val="EA5B13"/>
+          <w:sz w:val="22"/>
+        </w:rPr>
+        <w:t xml:space="preserve">Vrai streaming — </w:t>
+      </w:r>
+      <w:r>
+        <w:rPr>
+          <w:b w:val="0"/>
+          <w:i w:val="0"/>
+          <w:color w:val="1F1F1F"/>
+          <w:sz w:val="22"/>
+        </w:rPr>
+        <w:t>l'adaptateur émet la réponse en un bloc après génération complète. Pour l'UX, streamer token par token.</w:t>
+      </w:r>
+    </w:p>
+    <w:p>
+      <w:pPr>
+        <w:pStyle w:val="ListBullet"/>
+      </w:pPr>
+      <w:r>
+        <w:rPr>
+          <w:b/>
+          <w:i w:val="0"/>
+          <w:color w:val="EA5B13"/>
+          <w:sz w:val="22"/>
+        </w:rPr>
+        <w:t xml:space="preserve">Sources météo/prix réelles — </w:t>
+      </w:r>
+      <w:r>
+        <w:rPr>
+          <w:b w:val="0"/>
+          <w:i w:val="0"/>
+          <w:color w:val="1F1F1F"/>
+          <w:sz w:val="22"/>
+        </w:rPr>
+        <w:t>remplacer MeteoIndisponible/PrixIndisponible par des adaptateurs httpx (port mockable) avant que les agents Météo/Prix apportent une valeur.</w:t>
+      </w:r>
+    </w:p>
+    <w:p>
+      <w:pPr>
+        <w:pStyle w:val="ListBullet"/>
+      </w:pPr>
+      <w:r>
+        <w:rPr>
+          <w:b/>
+          <w:i w:val="0"/>
+          <w:color w:val="EA5B13"/>
+          <w:sz w:val="22"/>
+        </w:rPr>
+        <w:t xml:space="preserve">Composition multi-agents — </w:t>
+      </w:r>
+      <w:r>
+        <w:rPr>
+          <w:b w:val="0"/>
+          <w:i w:val="0"/>
+          <w:color w:val="1F1F1F"/>
+          <w:sz w:val="22"/>
+        </w:rPr>
+        <w:t>AgentReporting.synthetiser n'est pas encore branché dans l'orchestrateur (dispatch mono-agent). La synthèse fan-out/fan-in est une évolution V3+.</w:t>
+      </w:r>
+    </w:p>
+    <w:p>
+      <w:pPr>
+        <w:spacing w:after="160"/>
+        <w:ind w:left="240"/>
+      </w:pPr>
+      <w:r>
+        <w:rPr>
+          <w:b w:val="0"/>
+          <w:i/>
+          <w:color w:val="EA5B13"/>
+          <w:sz w:val="22"/>
+        </w:rPr>
+        <w:t>➤ Le routage déterministe reste volontairement conservateur : sans signal fort (mot climatique/marché en MOT ENTIER), on retombe sur le RAG. Un routage sémantique (embeddings) est la prochaine étape.</w:t>
       </w:r>
     </w:p>
     <w:p>

</xml_diff>

<commit_message>
docs(agents): MAJ doc (parité V2 faite, agent EUDR, pipeline orchestrateur 9 étapes)
</commit_message>
<xml_diff>
--- a/docs/Documentation_Socle_Agentique_V3.docx
+++ b/docs/Documentation_Socle_Agentique_V3.docx
@@ -470,7 +470,7 @@
           <w:sz w:val="18"/>
         </w:rPr>
         <w:br/>
-        <w:t>│ 3. ROUTEUR          (qui répond ? score peut_traiter)│</w:t>
+        <w:t>│ 3. clarification    (1er tour) ──► questions ────────┼─► Conseil</w:t>
       </w:r>
       <w:r>
         <w:rPr>
@@ -481,7 +481,7 @@
           <w:sz w:val="18"/>
         </w:rPr>
         <w:br/>
-        <w:t>│ 4. rate-limit       (avant inférence, après routage) │</w:t>
+        <w:t>│ 4. cache exact      (tour unique) ──► hit ───────────┼─► Conseil</w:t>
       </w:r>
       <w:r>
         <w:rPr>
@@ -492,7 +492,7 @@
           <w:sz w:val="18"/>
         </w:rPr>
         <w:br/>
-        <w:t>│ 5. dispatch ─► AGENT ─► OUTIL (météo/prix) ─► LLM     │</w:t>
+        <w:t>│ 5. ROUTEUR          (qui répond ? score peut_traiter)│</w:t>
       </w:r>
       <w:r>
         <w:rPr>
@@ -503,7 +503,7 @@
           <w:sz w:val="18"/>
         </w:rPr>
         <w:br/>
-        <w:t>│ 6. garde-fou SORTIE (vérifie la génération)          │</w:t>
+        <w:t>│ 6. rate-limit       (avant inférence, après routage) │</w:t>
       </w:r>
       <w:r>
         <w:rPr>
@@ -514,7 +514,29 @@
           <w:sz w:val="18"/>
         </w:rPr>
         <w:br/>
-        <w:t>│ 7. journalisation   (trace + interaction_id)         │</w:t>
+        <w:t>│ 7. dispatch ─► AGENT ─► OUTIL (météo/prix) ─► LLM     │</w:t>
+      </w:r>
+      <w:r>
+        <w:rPr>
+          <w:rFonts w:ascii="Consolas" w:hAnsi="Consolas"/>
+          <w:b w:val="0"/>
+          <w:i w:val="0"/>
+          <w:color w:val="1F1F1F"/>
+          <w:sz w:val="18"/>
+        </w:rPr>
+        <w:br/>
+        <w:t>│ 8. garde-fou SORTIE (vérifie la génération)          │</w:t>
+      </w:r>
+      <w:r>
+        <w:rPr>
+          <w:rFonts w:ascii="Consolas" w:hAnsi="Consolas"/>
+          <w:b w:val="0"/>
+          <w:i w:val="0"/>
+          <w:color w:val="1F1F1F"/>
+          <w:sz w:val="18"/>
+        </w:rPr>
+        <w:br/>
+        <w:t>│ 9. enrichissement ANADER + journalisation            │</w:t>
       </w:r>
       <w:r>
         <w:rPr>
@@ -1818,7 +1840,7 @@
           <w:color w:val="1F1F1F"/>
           <w:sz w:val="22"/>
         </w:rPr>
-        <w:t>C'est le control plane (plan de contrôle) / la boucle d'agent. Tout le reste exécute ; lui décide : qui agit, dans quel ordre, sous quelles contraintes. Équivalent agentique de ConseilService. L'ordre de ses 7 étapes encode la sécurité et l'équité.</w:t>
+        <w:t>C'est le control plane (plan de contrôle) / la boucle d'agent. Tout le reste exécute ; lui décide : qui agit, dans quel ordre, sous quelles contraintes. Équivalent agentique de ConseilService — il en a la PARITÉ : autour du dispatch, il enchaîne les mêmes concerns transverses (clarification, cache, enrichissement contact). L'ordre des étapes encode la sécurité et l'équité.</w:t>
       </w:r>
     </w:p>
     <w:p>
@@ -1866,7 +1888,7 @@
           <w:color w:val="EA5B13"/>
           <w:sz w:val="22"/>
         </w:rPr>
-        <w:t xml:space="preserve">Défense en profondeur (entrée ET sortie) — </w:t>
+        <w:t xml:space="preserve">Concerns transverses centralisés — </w:t>
       </w:r>
       <w:r>
         <w:rPr>
@@ -1875,7 +1897,7 @@
           <w:color w:val="1F1F1F"/>
           <w:sz w:val="22"/>
         </w:rPr>
-        <w:t>l'entrée bloque la demande interdite (sur le fil ancré → pas de contournement multi-tours) ; la sortie inspecte ce que l'agent a réellement généré. On ne fait jamais confiance à la sortie d'un LLM sans la vérifier.</w:t>
+        <w:t>clarification consultative (avant dispatch), cache exact (tour unique) et enrichissement contact ANADER (sur chaque réponse) sont dans l'orchestrateur, pas dans les agents — exactement comme les garde-fous. Mutualisés avec la V2 via application/conseil_commun.py.</w:t>
       </w:r>
     </w:p>
     <w:p>
@@ -1889,7 +1911,7 @@
           <w:color w:val="EA5B13"/>
           <w:sz w:val="22"/>
         </w:rPr>
-        <w:t xml:space="preserve">Rate-limit après le routage, avant l'inférence — </w:t>
+        <w:t xml:space="preserve">Défense en profondeur (entrée ET sortie) — </w:t>
       </w:r>
       <w:r>
         <w:rPr>
@@ -1898,7 +1920,7 @@
           <w:color w:val="1F1F1F"/>
           <w:sz w:val="22"/>
         </w:rPr>
-        <w:t>un refus ne coûte pas de génération CPU (~38 s) → il ne doit pas consommer le quota. On ne facture que le travail coûteux. Équité.</w:t>
+        <w:t>l'entrée bloque la demande interdite (sur le fil ancré → pas de contournement multi-tours) ; la sortie inspecte ce que l'agent a réellement généré. On ne fait jamais confiance à la sortie d'un LLM sans la vérifier.</w:t>
       </w:r>
     </w:p>
     <w:p>
@@ -1912,7 +1934,7 @@
           <w:color w:val="EA5B13"/>
           <w:sz w:val="22"/>
         </w:rPr>
-        <w:t xml:space="preserve">Repli systématique — </w:t>
+        <w:t xml:space="preserve">Rate-limit après routage/cache, avant l'inférence — </w:t>
       </w:r>
       <w:r>
         <w:rPr>
@@ -1921,7 +1943,7 @@
           <w:color w:val="1F1F1F"/>
           <w:sz w:val="22"/>
         </w:rPr>
-        <w:t>routeur indécis → agent RAG par défaut. « Je ne sais pas router » ≠ « je ne réponds pas ».</w:t>
+        <w:t>un refus, une clarification ou un hit de cache ne coûtent pas de génération CPU (~38 s) → ils ne consomment pas le quota. On ne facture que le travail coûteux. Équité.</w:t>
       </w:r>
     </w:p>
     <w:p>
@@ -1935,7 +1957,7 @@
           <w:color w:val="EA5B13"/>
           <w:sz w:val="22"/>
         </w:rPr>
-        <w:t xml:space="preserve">dataclasses.replace — </w:t>
+        <w:t xml:space="preserve">Repli systématique — </w:t>
       </w:r>
       <w:r>
         <w:rPr>
@@ -1944,7 +1966,7 @@
           <w:color w:val="1F1F1F"/>
           <w:sz w:val="22"/>
         </w:rPr>
-        <w:t>ajoute interaction_id à un Conseil frozen par copie (pas de mutation).</w:t>
+        <w:t>routeur indécis → agent RAG par défaut. « Je ne sais pas router » ≠ « je ne réponds pas ».</w:t>
       </w:r>
     </w:p>
     <w:p>
@@ -2018,7 +2040,7 @@
           <w:color w:val="606060"/>
           <w:sz w:val="20"/>
         </w:rPr>
-        <w:t>Les 7 étapes (extrait condensé) :</w:t>
+        <w:t>Le pipeline (extrait condensé) :</w:t>
       </w:r>
     </w:p>
     <w:p>
@@ -2046,7 +2068,7 @@
           <w:sz w:val="18"/>
         </w:rPr>
         <w:br/>
-        <w:t>refus = guardrails.evaluer(fil)              # 2. garde-fou ENTRÉE</w:t>
+        <w:t>if guardrails.evaluer(fil):                       # 2. garde-fou ENTRÉE</w:t>
       </w:r>
       <w:r>
         <w:rPr>
@@ -2057,7 +2079,7 @@
           <w:sz w:val="18"/>
         </w:rPr>
         <w:br/>
-        <w:t>if refus is not None:</w:t>
+        <w:t xml:space="preserve">    return ...refus enrichi ANADER...</w:t>
       </w:r>
       <w:r>
         <w:rPr>
@@ -2068,7 +2090,7 @@
           <w:sz w:val="18"/>
         </w:rPr>
         <w:br/>
-        <w:t xml:space="preserve">    return Conseil(refus.message, ELEVEE, [], redirection_anader=True)</w:t>
+        <w:t>if clarification.analyser(question, historique):  # 3. clarification (1er tour)</w:t>
       </w:r>
       <w:r>
         <w:rPr>
@@ -2079,7 +2101,7 @@
           <w:sz w:val="18"/>
         </w:rPr>
         <w:br/>
-        <w:t>agent = await self._routeur.meilleur(requete) or self._agent_de_repli()  # 3</w:t>
+        <w:t xml:space="preserve">    return ...questions...</w:t>
       </w:r>
       <w:r>
         <w:rPr>
@@ -2090,7 +2112,7 @@
           <w:sz w:val="18"/>
         </w:rPr>
         <w:br/>
-        <w:t>if await self._cache.hit_rate_limit(client_ip):  # 4. rate-limit</w:t>
+        <w:t>if not historique:                                # 4. cache exact</w:t>
       </w:r>
       <w:r>
         <w:rPr>
@@ -2101,7 +2123,7 @@
           <w:sz w:val="18"/>
         </w:rPr>
         <w:br/>
-        <w:t xml:space="preserve">    raise RateLimitDepasse</w:t>
+        <w:t xml:space="preserve">    if (c := await cache.get_cached(question, langue.value)):</w:t>
       </w:r>
       <w:r>
         <w:rPr>
@@ -2112,7 +2134,7 @@
           <w:sz w:val="18"/>
         </w:rPr>
         <w:br/>
-        <w:t>reponse = await agent.traiter(requete)       # 5. dispatch</w:t>
+        <w:t xml:space="preserve">        return ...enrichir(depuis_paquet(c))...</w:t>
       </w:r>
       <w:r>
         <w:rPr>
@@ -2123,7 +2145,7 @@
           <w:sz w:val="18"/>
         </w:rPr>
         <w:br/>
-        <w:t>if guardrails.verifier_reponse(reponse.texte):   # 6. garde-fou SORTIE</w:t>
+        <w:t>agent = await routeur.meilleur(requete) or repli  # 5. routage</w:t>
       </w:r>
       <w:r>
         <w:rPr>
@@ -2134,7 +2156,7 @@
           <w:sz w:val="18"/>
         </w:rPr>
         <w:br/>
-        <w:t xml:space="preserve">    return Conseil(guardrails.REFUS_PHYTO, ELEVEE, [], redirection_anader=True)</w:t>
+        <w:t>if await cache.hit_rate_limit(client_ip):         # 6. rate-limit</w:t>
       </w:r>
       <w:r>
         <w:rPr>
@@ -2145,245 +2167,8 @@
           <w:sz w:val="18"/>
         </w:rPr>
         <w:br/>
-        <w:t>return await self._journaliser(question, langue, conseil)  # 7</w:t>
-      </w:r>
-    </w:p>
-    <w:p>
-      <w:pPr>
-        <w:pStyle w:val="Heading3"/>
-      </w:pPr>
-      <w:r>
-        <w:rPr>
-          <w:color w:val="EA5B13"/>
-        </w:rPr>
-        <w:t>Ce que les tests verrouillent</w:t>
-      </w:r>
-    </w:p>
-    <w:p>
-      <w:pPr>
-        <w:pStyle w:val="ListBullet"/>
-      </w:pPr>
-      <w:r>
-        <w:rPr>
-          <w:b w:val="0"/>
-          <w:i w:val="0"/>
-          <w:color w:val="1F1F1F"/>
-          <w:sz w:val="22"/>
-        </w:rPr>
-        <w:t>Route vers l'agent le plus pertinent (météo &gt; rag) ; l'autre agent n'est pas appelé.</w:t>
-      </w:r>
-    </w:p>
-    <w:p>
-      <w:pPr>
-        <w:pStyle w:val="ListBullet"/>
-      </w:pPr>
-      <w:r>
-        <w:rPr>
-          <w:b w:val="0"/>
-          <w:i w:val="0"/>
-          <w:color w:val="1F1F1F"/>
-          <w:sz w:val="22"/>
-        </w:rPr>
-        <w:t>Repli sur l'agent par défaut quand aucun routage n'aboutit.</w:t>
-      </w:r>
-    </w:p>
-    <w:p>
-      <w:pPr>
-        <w:pStyle w:val="ListBullet"/>
-      </w:pPr>
-      <w:r>
-        <w:rPr>
-          <w:b w:val="0"/>
-          <w:i w:val="0"/>
-          <w:color w:val="1F1F1F"/>
-          <w:sz w:val="22"/>
-        </w:rPr>
-        <w:t>Une question hors filière (maïs) déclenche un refus ANADER SANS appeler d'agent.</w:t>
-      </w:r>
-    </w:p>
-    <w:p>
-      <w:pPr>
-        <w:pStyle w:val="ListBullet"/>
-      </w:pPr>
-      <w:r>
-        <w:rPr>
-          <w:b w:val="0"/>
-          <w:i w:val="0"/>
-          <w:color w:val="1F1F1F"/>
-          <w:sz w:val="22"/>
-        </w:rPr>
-        <w:t>L'interaction est journalisée (interaction_id rattaché).</w:t>
-      </w:r>
-    </w:p>
-    <w:p>
-      <w:pPr>
-        <w:pStyle w:val="ListBullet"/>
-      </w:pPr>
-      <w:r>
-        <w:rPr>
-          <w:b w:val="0"/>
-          <w:i w:val="0"/>
-          <w:color w:val="1F1F1F"/>
-          <w:sz w:val="22"/>
-        </w:rPr>
-        <w:t>Le rate-limit lève RateLimitDepasse avant l'inférence.</w:t>
-      </w:r>
-    </w:p>
-    <w:p>
-      <w:r>
-        <w:br w:type="page"/>
-      </w:r>
-    </w:p>
-    <w:p>
-      <w:pPr>
-        <w:pStyle w:val="Heading1"/>
-      </w:pPr>
-      <w:r>
-        <w:rPr>
-          <w:color w:val="EA5B13"/>
-        </w:rPr>
-        <w:t>5. Le squelette d'agent — services/agents/base.py + agent_rag.py</w:t>
-      </w:r>
-    </w:p>
-    <w:p>
-      <w:pPr>
-        <w:pStyle w:val="Heading3"/>
-      </w:pPr>
-      <w:r>
-        <w:rPr>
-          <w:color w:val="EA5B13"/>
-        </w:rPr>
-        <w:t>Le concept</w:t>
-      </w:r>
-    </w:p>
-    <w:p>
-      <w:pPr>
-        <w:spacing w:after="120"/>
-      </w:pPr>
-      <w:r>
-        <w:rPr>
-          <w:b w:val="0"/>
-          <w:i w:val="0"/>
-          <w:color w:val="1F1F1F"/>
-          <w:sz w:val="22"/>
-        </w:rPr>
-        <w:t>Agentifier une capacité existante = l'envelopper dans AgentPort. Avant d'écrire 4 agents qui font tous « appeler le LLM → extraire les sources → estimer la confiance → signer », on factorise cette mécanique dans AgentBase. C'est le pattern Template Method : la base définit le squelette, chaque agent ne fournit que sa spécificité (quel contexte injecter, comment scorer).</w:t>
-      </w:r>
-    </w:p>
-    <w:p>
-      <w:pPr>
-        <w:pStyle w:val="Heading3"/>
-      </w:pPr>
-      <w:r>
-        <w:rPr>
-          <w:color w:val="EA5B13"/>
-        </w:rPr>
-        <w:t>Les décisions de conception</w:t>
-      </w:r>
-    </w:p>
-    <w:p>
-      <w:pPr>
-        <w:pStyle w:val="ListBullet"/>
-      </w:pPr>
-      <w:r>
-        <w:rPr>
-          <w:b/>
-          <w:i w:val="0"/>
-          <w:color w:val="EA5B13"/>
-          <w:sz w:val="22"/>
-        </w:rPr>
-        <w:t xml:space="preserve">AgentBase est optionnelle — </w:t>
-      </w:r>
-      <w:r>
-        <w:rPr>
-          <w:b w:val="0"/>
-          <w:i w:val="0"/>
-          <w:color w:val="1F1F1F"/>
-          <w:sz w:val="22"/>
-        </w:rPr>
-        <w:t>le contrat reste un Protocol ; la base est un confort (DRY). On sépare ce qu'on DOIT respecter (contrat) de ce qu'on PEUT réutiliser (commodité).</w:t>
-      </w:r>
-    </w:p>
-    <w:p>
-      <w:pPr>
-        <w:pStyle w:val="ListBullet"/>
-      </w:pPr>
-      <w:r>
-        <w:rPr>
-          <w:b/>
-          <w:i w:val="0"/>
-          <w:color w:val="EA5B13"/>
-          <w:sz w:val="22"/>
-        </w:rPr>
-        <w:t xml:space="preserve">RAG = agent par défaut — </w:t>
-      </w:r>
-      <w:r>
-        <w:rPr>
-          <w:b w:val="0"/>
-          <w:i w:val="0"/>
-          <w:color w:val="1F1F1F"/>
-          <w:sz w:val="22"/>
-        </w:rPr>
-        <w:t>généraliste ancré sur sources officielles → toujours un bon repli. Son peut_traiter renvoie un plancher modéré (0.4) : éligible partout, facile à battre par un spécialiste.</w:t>
-      </w:r>
-    </w:p>
-    <w:p>
-      <w:pPr>
-        <w:pStyle w:val="Heading3"/>
-      </w:pPr>
-      <w:r>
-        <w:rPr>
-          <w:color w:val="EA5B13"/>
-        </w:rPr>
-        <w:t>Modèle mental</w:t>
-      </w:r>
-    </w:p>
-    <w:p>
-      <w:pPr>
-        <w:spacing w:after="160"/>
-        <w:ind w:left="240"/>
-      </w:pPr>
-      <w:r>
-        <w:rPr>
-          <w:b w:val="0"/>
-          <w:i/>
-          <w:color w:val="EA5B13"/>
-          <w:sz w:val="22"/>
-        </w:rPr>
-        <w:t>➤ Un agent concret = le contexte qu'il sait fabriquer + le score qu'il s'attribue. Le reste est mutualisé.</w:t>
-      </w:r>
-    </w:p>
-    <w:p>
-      <w:pPr>
-        <w:pStyle w:val="Heading3"/>
-      </w:pPr>
-      <w:r>
-        <w:rPr>
-          <w:color w:val="EA5B13"/>
-        </w:rPr>
-        <w:t>Code</w:t>
-      </w:r>
-    </w:p>
-    <w:p>
-      <w:pPr>
-        <w:spacing w:after="40"/>
-      </w:pPr>
-      <w:r>
-        <w:rPr>
-          <w:b w:val="0"/>
-          <w:i/>
-          <w:color w:val="606060"/>
-          <w:sz w:val="20"/>
-        </w:rPr>
-        <w:t>AgentBase._generer (mutualisé) :</w:t>
-      </w:r>
-    </w:p>
-    <w:p>
-      <w:pPr>
-        <w:spacing w:before="80" w:after="160"/>
-        <w:ind w:left="160"/>
-        <w:shd w:val="clear" w:fill="F2F2F2"/>
-      </w:pPr>
+        <w:t xml:space="preserve">    raise RateLimitDepasse</w:t>
+      </w:r>
       <w:r>
         <w:rPr>
           <w:rFonts w:ascii="Consolas" w:hAnsi="Consolas"/>
@@ -2392,7 +2177,8 @@
           <w:color w:val="1F1F1F"/>
           <w:sz w:val="18"/>
         </w:rPr>
-        <w:t>async def _generer(self, requete, contexte: str | None) -&gt; AgentReponse:</w:t>
+        <w:br/>
+        <w:t>reponse = await agent.traiter(requete)            # 7. dispatch</w:t>
       </w:r>
       <w:r>
         <w:rPr>
@@ -2403,7 +2189,7 @@
           <w:sz w:val="18"/>
         </w:rPr>
         <w:br/>
-        <w:t xml:space="preserve">    texte = await self._inference.generer(</w:t>
+        <w:t>if guardrails.verifier_reponse(reponse.texte):    # 8. garde-fou SORTIE</w:t>
       </w:r>
       <w:r>
         <w:rPr>
@@ -2414,7 +2200,7 @@
           <w:sz w:val="18"/>
         </w:rPr>
         <w:br/>
-        <w:t xml:space="preserve">        requete.question, contexte=contexte, historique=requete.historique)</w:t>
+        <w:t xml:space="preserve">    return ...REFUS_PHYTO...</w:t>
       </w:r>
       <w:r>
         <w:rPr>
@@ -2425,7 +2211,7 @@
           <w:sz w:val="18"/>
         </w:rPr>
         <w:br/>
-        <w:t xml:space="preserve">    sources = postprocess.extraire_sources(texte)</w:t>
+        <w:t>await cache.set_cached(...)                        # 9. cache + enrichir + journal</w:t>
       </w:r>
       <w:r>
         <w:rPr>
@@ -2436,8 +2222,245 @@
           <w:sz w:val="18"/>
         </w:rPr>
         <w:br/>
-        <w:t xml:space="preserve">    return AgentReponse(texte, sources,</w:t>
-      </w:r>
+        <w:t>return await journaliser(enrichir_contact(conseil, texte_conv))</w:t>
+      </w:r>
+    </w:p>
+    <w:p>
+      <w:pPr>
+        <w:pStyle w:val="Heading3"/>
+      </w:pPr>
+      <w:r>
+        <w:rPr>
+          <w:color w:val="EA5B13"/>
+        </w:rPr>
+        <w:t>Ce que les tests verrouillent</w:t>
+      </w:r>
+    </w:p>
+    <w:p>
+      <w:pPr>
+        <w:pStyle w:val="ListBullet"/>
+      </w:pPr>
+      <w:r>
+        <w:rPr>
+          <w:b w:val="0"/>
+          <w:i w:val="0"/>
+          <w:color w:val="1F1F1F"/>
+          <w:sz w:val="22"/>
+        </w:rPr>
+        <w:t>Route vers l'agent le plus pertinent (météo &gt; rag) ; l'autre agent n'est pas appelé.</w:t>
+      </w:r>
+    </w:p>
+    <w:p>
+      <w:pPr>
+        <w:pStyle w:val="ListBullet"/>
+      </w:pPr>
+      <w:r>
+        <w:rPr>
+          <w:b w:val="0"/>
+          <w:i w:val="0"/>
+          <w:color w:val="1F1F1F"/>
+          <w:sz w:val="22"/>
+        </w:rPr>
+        <w:t>Repli sur l'agent par défaut quand aucun routage n'aboutit.</w:t>
+      </w:r>
+    </w:p>
+    <w:p>
+      <w:pPr>
+        <w:pStyle w:val="ListBullet"/>
+      </w:pPr>
+      <w:r>
+        <w:rPr>
+          <w:b w:val="0"/>
+          <w:i w:val="0"/>
+          <w:color w:val="1F1F1F"/>
+          <w:sz w:val="22"/>
+        </w:rPr>
+        <w:t>Une question hors filière (maïs) déclenche un refus ANADER SANS appeler d'agent.</w:t>
+      </w:r>
+    </w:p>
+    <w:p>
+      <w:pPr>
+        <w:pStyle w:val="ListBullet"/>
+      </w:pPr>
+      <w:r>
+        <w:rPr>
+          <w:b w:val="0"/>
+          <w:i w:val="0"/>
+          <w:color w:val="1F1F1F"/>
+          <w:sz w:val="22"/>
+        </w:rPr>
+        <w:t>L'interaction est journalisée (interaction_id rattaché).</w:t>
+      </w:r>
+    </w:p>
+    <w:p>
+      <w:pPr>
+        <w:pStyle w:val="ListBullet"/>
+      </w:pPr>
+      <w:r>
+        <w:rPr>
+          <w:b w:val="0"/>
+          <w:i w:val="0"/>
+          <w:color w:val="1F1F1F"/>
+          <w:sz w:val="22"/>
+        </w:rPr>
+        <w:t>Le rate-limit lève RateLimitDepasse avant l'inférence.</w:t>
+      </w:r>
+    </w:p>
+    <w:p>
+      <w:r>
+        <w:br w:type="page"/>
+      </w:r>
+    </w:p>
+    <w:p>
+      <w:pPr>
+        <w:pStyle w:val="Heading1"/>
+      </w:pPr>
+      <w:r>
+        <w:rPr>
+          <w:color w:val="EA5B13"/>
+        </w:rPr>
+        <w:t>5. Le squelette d'agent — services/agents/base.py + agent_rag.py</w:t>
+      </w:r>
+    </w:p>
+    <w:p>
+      <w:pPr>
+        <w:pStyle w:val="Heading3"/>
+      </w:pPr>
+      <w:r>
+        <w:rPr>
+          <w:color w:val="EA5B13"/>
+        </w:rPr>
+        <w:t>Le concept</w:t>
+      </w:r>
+    </w:p>
+    <w:p>
+      <w:pPr>
+        <w:spacing w:after="120"/>
+      </w:pPr>
+      <w:r>
+        <w:rPr>
+          <w:b w:val="0"/>
+          <w:i w:val="0"/>
+          <w:color w:val="1F1F1F"/>
+          <w:sz w:val="22"/>
+        </w:rPr>
+        <w:t>Agentifier une capacité existante = l'envelopper dans AgentPort. Avant d'écrire 4 agents qui font tous « appeler le LLM → extraire les sources → estimer la confiance → signer », on factorise cette mécanique dans AgentBase. C'est le pattern Template Method : la base définit le squelette, chaque agent ne fournit que sa spécificité (quel contexte injecter, comment scorer).</w:t>
+      </w:r>
+    </w:p>
+    <w:p>
+      <w:pPr>
+        <w:pStyle w:val="Heading3"/>
+      </w:pPr>
+      <w:r>
+        <w:rPr>
+          <w:color w:val="EA5B13"/>
+        </w:rPr>
+        <w:t>Les décisions de conception</w:t>
+      </w:r>
+    </w:p>
+    <w:p>
+      <w:pPr>
+        <w:pStyle w:val="ListBullet"/>
+      </w:pPr>
+      <w:r>
+        <w:rPr>
+          <w:b/>
+          <w:i w:val="0"/>
+          <w:color w:val="EA5B13"/>
+          <w:sz w:val="22"/>
+        </w:rPr>
+        <w:t xml:space="preserve">AgentBase est optionnelle — </w:t>
+      </w:r>
+      <w:r>
+        <w:rPr>
+          <w:b w:val="0"/>
+          <w:i w:val="0"/>
+          <w:color w:val="1F1F1F"/>
+          <w:sz w:val="22"/>
+        </w:rPr>
+        <w:t>le contrat reste un Protocol ; la base est un confort (DRY). On sépare ce qu'on DOIT respecter (contrat) de ce qu'on PEUT réutiliser (commodité).</w:t>
+      </w:r>
+    </w:p>
+    <w:p>
+      <w:pPr>
+        <w:pStyle w:val="ListBullet"/>
+      </w:pPr>
+      <w:r>
+        <w:rPr>
+          <w:b/>
+          <w:i w:val="0"/>
+          <w:color w:val="EA5B13"/>
+          <w:sz w:val="22"/>
+        </w:rPr>
+        <w:t xml:space="preserve">RAG = agent par défaut — </w:t>
+      </w:r>
+      <w:r>
+        <w:rPr>
+          <w:b w:val="0"/>
+          <w:i w:val="0"/>
+          <w:color w:val="1F1F1F"/>
+          <w:sz w:val="22"/>
+        </w:rPr>
+        <w:t>généraliste ancré sur sources officielles → toujours un bon repli. Son peut_traiter renvoie un plancher modéré (0.4) : éligible partout, facile à battre par un spécialiste.</w:t>
+      </w:r>
+    </w:p>
+    <w:p>
+      <w:pPr>
+        <w:pStyle w:val="Heading3"/>
+      </w:pPr>
+      <w:r>
+        <w:rPr>
+          <w:color w:val="EA5B13"/>
+        </w:rPr>
+        <w:t>Modèle mental</w:t>
+      </w:r>
+    </w:p>
+    <w:p>
+      <w:pPr>
+        <w:spacing w:after="160"/>
+        <w:ind w:left="240"/>
+      </w:pPr>
+      <w:r>
+        <w:rPr>
+          <w:b w:val="0"/>
+          <w:i/>
+          <w:color w:val="EA5B13"/>
+          <w:sz w:val="22"/>
+        </w:rPr>
+        <w:t>➤ Un agent concret = le contexte qu'il sait fabriquer + le score qu'il s'attribue. Le reste est mutualisé.</w:t>
+      </w:r>
+    </w:p>
+    <w:p>
+      <w:pPr>
+        <w:pStyle w:val="Heading3"/>
+      </w:pPr>
+      <w:r>
+        <w:rPr>
+          <w:color w:val="EA5B13"/>
+        </w:rPr>
+        <w:t>Code</w:t>
+      </w:r>
+    </w:p>
+    <w:p>
+      <w:pPr>
+        <w:spacing w:after="40"/>
+      </w:pPr>
+      <w:r>
+        <w:rPr>
+          <w:b w:val="0"/>
+          <w:i/>
+          <w:color w:val="606060"/>
+          <w:sz w:val="20"/>
+        </w:rPr>
+        <w:t>AgentBase._generer (mutualisé) :</w:t>
+      </w:r>
+    </w:p>
+    <w:p>
+      <w:pPr>
+        <w:spacing w:before="80" w:after="160"/>
+        <w:ind w:left="160"/>
+        <w:shd w:val="clear" w:fill="F2F2F2"/>
+      </w:pPr>
       <w:r>
         <w:rPr>
           <w:rFonts w:ascii="Consolas" w:hAnsi="Consolas"/>
@@ -2446,264 +2469,8 @@
           <w:color w:val="1F1F1F"/>
           <w:sz w:val="18"/>
         </w:rPr>
-        <w:br/>
-        <w:t xml:space="preserve">        postprocess.estimer_confiance(sources), agent=self.nom)</w:t>
-      </w:r>
-    </w:p>
-    <w:p>
-      <w:pPr>
-        <w:pStyle w:val="Heading3"/>
-      </w:pPr>
-      <w:r>
-        <w:rPr>
-          <w:color w:val="EA5B13"/>
-        </w:rPr>
-        <w:t>Ce que les tests verrouillent</w:t>
-      </w:r>
-    </w:p>
-    <w:p>
-      <w:pPr>
-        <w:pStyle w:val="ListBullet"/>
-      </w:pPr>
-      <w:r>
-        <w:rPr>
-          <w:b w:val="0"/>
-          <w:i w:val="0"/>
-          <w:color w:val="1F1F1F"/>
-          <w:sz w:val="22"/>
-        </w:rPr>
-        <w:t>L'agent RAG passe le contexte documentaire récupéré à l'inférence.</w:t>
-      </w:r>
-    </w:p>
-    <w:p>
-      <w:pPr>
-        <w:pStyle w:val="ListBullet"/>
-      </w:pPr>
-      <w:r>
-        <w:rPr>
-          <w:b w:val="0"/>
-          <w:i w:val="0"/>
-          <w:color w:val="1F1F1F"/>
-          <w:sz w:val="22"/>
-        </w:rPr>
-        <w:t>Sans récupérateur RAG, l'agent fonctionne quand même (contexte None).</w:t>
-      </w:r>
-    </w:p>
-    <w:p>
-      <w:pPr>
-        <w:pStyle w:val="ListBullet"/>
-      </w:pPr>
-      <w:r>
-        <w:rPr>
-          <w:b w:val="0"/>
-          <w:i w:val="0"/>
-          <w:color w:val="1F1F1F"/>
-          <w:sz w:val="22"/>
-        </w:rPr>
-        <w:t>Son score plancher le rend éligible comme repli.</w:t>
-      </w:r>
-    </w:p>
-    <w:p>
-      <w:r>
-        <w:br w:type="page"/>
-      </w:r>
-    </w:p>
-    <w:p>
-      <w:pPr>
-        <w:pStyle w:val="Heading1"/>
-      </w:pPr>
-      <w:r>
-        <w:rPr>
-          <w:color w:val="EA5B13"/>
-        </w:rPr>
-        <w:t>6. Le tool use — services/outils/meteo.py + agent_meteo.py</w:t>
-      </w:r>
-    </w:p>
-    <w:p>
-      <w:pPr>
-        <w:pStyle w:val="Heading3"/>
-      </w:pPr>
-      <w:r>
-        <w:rPr>
-          <w:color w:val="EA5B13"/>
-        </w:rPr>
-        <w:t>Le concept</w:t>
-      </w:r>
-    </w:p>
-    <w:p>
-      <w:pPr>
-        <w:spacing w:after="120"/>
-      </w:pPr>
-      <w:r>
-        <w:rPr>
-          <w:b w:val="0"/>
-          <w:i w:val="0"/>
-          <w:color w:val="1F1F1F"/>
-          <w:sz w:val="22"/>
-        </w:rPr>
-        <w:t>Le pattern fondateur de l'agentique. Un chatbot parle (depuis sa mémoire figée) ; un agent agit : il appelle des outils qui ramènent des données fraîches, puis raisonne dessus. L'agent Météo récupère les prévisions via OutilMeteo, les injecte comme contexte factuel dans le prompt, et le LLM raisonne sur des faits, pas sur sa mémoire (grounding). C'est le « function calling » des grands frameworks, mais explicite et déterministe.</w:t>
-      </w:r>
-    </w:p>
-    <w:p>
-      <w:pPr>
-        <w:pStyle w:val="Heading3"/>
-      </w:pPr>
-      <w:r>
-        <w:rPr>
-          <w:color w:val="EA5B13"/>
-        </w:rPr>
-        <w:t>Les décisions de conception</w:t>
-      </w:r>
-    </w:p>
-    <w:p>
-      <w:pPr>
-        <w:pStyle w:val="ListBullet"/>
-      </w:pPr>
-      <w:r>
-        <w:rPr>
-          <w:b/>
-          <w:i w:val="0"/>
-          <w:color w:val="EA5B13"/>
-          <w:sz w:val="22"/>
-        </w:rPr>
-        <w:t xml:space="preserve">Séparer l'OUTIL de l'AGENT — </w:t>
-      </w:r>
-      <w:r>
-        <w:rPr>
-          <w:b w:val="0"/>
-          <w:i w:val="0"/>
-          <w:color w:val="1F1F1F"/>
-          <w:sz w:val="22"/>
-        </w:rPr>
-        <w:t>l'outil récupère la donnée (I/O, mockable, réutilisable) ; l'agent raisonne dessus (logique, sans réseau direct). On teste chacun isolément.</w:t>
-      </w:r>
-    </w:p>
-    <w:p>
-      <w:pPr>
-        <w:pStyle w:val="ListBullet"/>
-      </w:pPr>
-      <w:r>
-        <w:rPr>
-          <w:b/>
-          <w:i w:val="0"/>
-          <w:color w:val="EA5B13"/>
-          <w:sz w:val="22"/>
-        </w:rPr>
-        <w:t xml:space="preserve">Port mockable (MeteoPort) — </w:t>
-      </w:r>
-      <w:r>
-        <w:rPr>
-          <w:b w:val="0"/>
-          <w:i w:val="0"/>
-          <w:color w:val="1F1F1F"/>
-          <w:sz w:val="22"/>
-        </w:rPr>
-        <w:t>aucun appel réseau en test ; la source est interchangeable. Aucun LLM tiers — données factuelles uniquement (souveraineté).</w:t>
-      </w:r>
-    </w:p>
-    <w:p>
-      <w:pPr>
-        <w:pStyle w:val="ListBullet"/>
-      </w:pPr>
-      <w:r>
-        <w:rPr>
-          <w:b/>
-          <w:i w:val="0"/>
-          <w:color w:val="EA5B13"/>
-          <w:sz w:val="22"/>
-        </w:rPr>
-        <w:t xml:space="preserve">Fail-soft — </w:t>
-      </w:r>
-      <w:r>
-        <w:rPr>
-          <w:b w:val="0"/>
-          <w:i w:val="0"/>
-          <w:color w:val="1F1F1F"/>
-          <w:sz w:val="22"/>
-        </w:rPr>
-        <w:t>si l'API plante, l'outil renvoie {} au lieu d'exploser ; l'agent dégrade en conseil générique. Un outil qui échoue ne fait jamais tomber l'agent.</w:t>
-      </w:r>
-    </w:p>
-    <w:p>
-      <w:pPr>
-        <w:pStyle w:val="ListBullet"/>
-      </w:pPr>
-      <w:r>
-        <w:rPr>
-          <w:b/>
-          <w:i w:val="0"/>
-          <w:color w:val="EA5B13"/>
-          <w:sz w:val="22"/>
-        </w:rPr>
-        <w:t xml:space="preserve">Routage par mots-clés — </w:t>
-      </w:r>
-      <w:r>
-        <w:rPr>
-          <w:b w:val="0"/>
-          <w:i w:val="0"/>
-          <w:color w:val="1F1F1F"/>
-          <w:sz w:val="22"/>
-        </w:rPr>
-        <w:t>peut_traiter monte avec le nombre de termes climat détectés (0.7 + 0.1 × touches, plafonné à 1.0).</w:t>
-      </w:r>
-    </w:p>
-    <w:p>
-      <w:pPr>
-        <w:pStyle w:val="Heading3"/>
-      </w:pPr>
-      <w:r>
-        <w:rPr>
-          <w:color w:val="EA5B13"/>
-        </w:rPr>
-        <w:t>Modèle mental</w:t>
-      </w:r>
-    </w:p>
-    <w:p>
-      <w:pPr>
-        <w:spacing w:after="160"/>
-        <w:ind w:left="240"/>
-      </w:pPr>
-      <w:r>
-        <w:rPr>
-          <w:b w:val="0"/>
-          <w:i/>
-          <w:color w:val="EA5B13"/>
-          <w:sz w:val="22"/>
-        </w:rPr>
-        <w:t>➤ L'outil = les yeux et les mains de l'agent sur le monde réel. L'agent = le cerveau qui décide quoi en faire.</w:t>
-      </w:r>
-    </w:p>
-    <w:p>
-      <w:pPr>
-        <w:pStyle w:val="Heading3"/>
-      </w:pPr>
-      <w:r>
-        <w:rPr>
-          <w:color w:val="EA5B13"/>
-        </w:rPr>
-        <w:t>Code</w:t>
-      </w:r>
-    </w:p>
-    <w:p>
-      <w:pPr>
-        <w:spacing w:after="40"/>
-      </w:pPr>
-      <w:r>
-        <w:rPr>
-          <w:b w:val="0"/>
-          <w:i/>
-          <w:color w:val="606060"/>
-          <w:sz w:val="20"/>
-        </w:rPr>
-        <w:t>L'agent récupère puis injecte (extrait) :</w:t>
-      </w:r>
-    </w:p>
-    <w:p>
-      <w:pPr>
-        <w:spacing w:before="80" w:after="160"/>
-        <w:ind w:left="160"/>
-        <w:shd w:val="clear" w:fill="F2F2F2"/>
-      </w:pPr>
+        <w:t>async def _generer(self, requete, contexte: str | None) -&gt; AgentReponse:</w:t>
+      </w:r>
       <w:r>
         <w:rPr>
           <w:rFonts w:ascii="Consolas" w:hAnsi="Consolas"/>
@@ -2712,7 +2479,8 @@
           <w:color w:val="1F1F1F"/>
           <w:sz w:val="18"/>
         </w:rPr>
-        <w:t>async def traiter(self, requete) -&gt; AgentReponse:</w:t>
+        <w:br/>
+        <w:t xml:space="preserve">    texte = await self._inference.generer(</w:t>
       </w:r>
       <w:r>
         <w:rPr>
@@ -2723,7 +2491,7 @@
           <w:sz w:val="18"/>
         </w:rPr>
         <w:br/>
-        <w:t xml:space="preserve">    localite = _detecter_localite(requete.fil_ancre) or self._geo_defaut</w:t>
+        <w:t xml:space="preserve">        requete.question, contexte=contexte, historique=requete.historique)</w:t>
       </w:r>
       <w:r>
         <w:rPr>
@@ -2734,7 +2502,7 @@
           <w:sz w:val="18"/>
         </w:rPr>
         <w:br/>
-        <w:t xml:space="preserve">    previsions = await self._outil.invoquer(localite=localite)  # tool use</w:t>
+        <w:t xml:space="preserve">    sources = postprocess.extraire_sources(texte)</w:t>
       </w:r>
       <w:r>
         <w:rPr>
@@ -2745,7 +2513,7 @@
           <w:sz w:val="18"/>
         </w:rPr>
         <w:br/>
-        <w:t xml:space="preserve">    contexte = _formater_previsions(localite, previsions)</w:t>
+        <w:t xml:space="preserve">    return AgentReponse(texte, sources,</w:t>
       </w:r>
       <w:r>
         <w:rPr>
@@ -2756,7 +2524,7 @@
           <w:sz w:val="18"/>
         </w:rPr>
         <w:br/>
-        <w:t xml:space="preserve">    return await self._generer(requete, contexte)  # le LLM raisonne sur les faits</w:t>
+        <w:t xml:space="preserve">        postprocess.estimer_confiance(sources), agent=self.nom)</w:t>
       </w:r>
     </w:p>
     <w:p>
@@ -2781,7 +2549,7 @@
           <w:color w:val="1F1F1F"/>
           <w:sz w:val="22"/>
         </w:rPr>
-        <w:t>Score élevé sur une question météo, quasi nul sur une question prix.</w:t>
+        <w:t>L'agent RAG passe le contexte documentaire récupéré à l'inférence.</w:t>
       </w:r>
     </w:p>
     <w:p>
@@ -2795,39 +2563,12 @@
           <w:color w:val="1F1F1F"/>
           <w:sz w:val="22"/>
         </w:rPr>
-        <w:t>Les prévisions récupérées sont bien injectées dans le contexte passé au LLM.</w:t>
+        <w:t>Sans récupérateur RAG, l'agent fonctionne quand même (contexte None).</w:t>
       </w:r>
     </w:p>
     <w:p>
-      <w:r>
-        <w:br w:type="page"/>
-      </w:r>
-    </w:p>
-    <w:p>
-      <w:pPr>
-        <w:pStyle w:val="Heading1"/>
-      </w:pPr>
-      <w:r>
-        <w:rPr>
-          <w:color w:val="EA5B13"/>
-        </w:rPr>
-        <w:t>7. Réplication du pattern — services/outils/prix.py + agent_prix.py</w:t>
-      </w:r>
-    </w:p>
-    <w:p>
-      <w:pPr>
-        <w:pStyle w:val="Heading3"/>
-      </w:pPr>
-      <w:r>
-        <w:rPr>
-          <w:color w:val="EA5B13"/>
-        </w:rPr>
-        <w:t>Le concept</w:t>
-      </w:r>
-    </w:p>
-    <w:p>
-      <w:pPr>
-        <w:spacing w:after="120"/>
+      <w:pPr>
+        <w:pStyle w:val="ListBullet"/>
       </w:pPr>
       <w:r>
         <w:rPr>
@@ -2836,7 +2577,48 @@
           <w:color w:val="1F1F1F"/>
           <w:sz w:val="22"/>
         </w:rPr>
-        <w:t>L'agent Prix est le jumeau de l'agent Météo : même moule (outil + port mockable + injection de contexte), domaine différent (prix/marché du cacao). Sa valeur pédagogique : prouver que le framework tient.</w:t>
+        <w:t>Son score plancher le rend éligible comme repli.</w:t>
+      </w:r>
+    </w:p>
+    <w:p>
+      <w:r>
+        <w:br w:type="page"/>
+      </w:r>
+    </w:p>
+    <w:p>
+      <w:pPr>
+        <w:pStyle w:val="Heading1"/>
+      </w:pPr>
+      <w:r>
+        <w:rPr>
+          <w:color w:val="EA5B13"/>
+        </w:rPr>
+        <w:t>6. Le tool use — services/outils/meteo.py + agent_meteo.py</w:t>
+      </w:r>
+    </w:p>
+    <w:p>
+      <w:pPr>
+        <w:pStyle w:val="Heading3"/>
+      </w:pPr>
+      <w:r>
+        <w:rPr>
+          <w:color w:val="EA5B13"/>
+        </w:rPr>
+        <w:t>Le concept</w:t>
+      </w:r>
+    </w:p>
+    <w:p>
+      <w:pPr>
+        <w:spacing w:after="120"/>
+      </w:pPr>
+      <w:r>
+        <w:rPr>
+          <w:b w:val="0"/>
+          <w:i w:val="0"/>
+          <w:color w:val="1F1F1F"/>
+          <w:sz w:val="22"/>
+        </w:rPr>
+        <w:t>Le pattern fondateur de l'agentique. Un chatbot parle (depuis sa mémoire figée) ; un agent agit : il appelle des outils qui ramènent des données fraîches, puis raisonne dessus. L'agent Météo récupère les prévisions via OutilMeteo, les injecte comme contexte factuel dans le prompt, et le LLM raisonne sur des faits, pas sur sa mémoire (grounding). C'est le « function calling » des grands frameworks, mais explicite et déterministe.</w:t>
       </w:r>
     </w:p>
     <w:p>
@@ -2861,7 +2643,7 @@
           <w:color w:val="EA5B13"/>
           <w:sz w:val="22"/>
         </w:rPr>
-        <w:t xml:space="preserve">Coût marginal faible et constant — </w:t>
+        <w:t xml:space="preserve">Séparer l'OUTIL de l'AGENT — </w:t>
       </w:r>
       <w:r>
         <w:rPr>
@@ -2870,7 +2652,7 @@
           <w:color w:val="1F1F1F"/>
           <w:sz w:val="22"/>
         </w:rPr>
-        <w:t>le test d'un bon socle : ajouter l'agent n°5..n°11 = recopier le moule en changeant le domaine.</w:t>
+        <w:t>l'outil récupère la donnée (I/O, mockable, réutilisable) ; l'agent raisonne dessus (logique, sans réseau direct). On teste chacun isolément.</w:t>
       </w:r>
     </w:p>
     <w:p>
@@ -2884,7 +2666,7 @@
           <w:color w:val="EA5B13"/>
           <w:sz w:val="22"/>
         </w:rPr>
-        <w:t xml:space="preserve">invoquer(**kwargs) absorbe la différence — </w:t>
+        <w:t xml:space="preserve">Port mockable (MeteoPort) — </w:t>
       </w:r>
       <w:r>
         <w:rPr>
@@ -2893,7 +2675,53 @@
           <w:color w:val="1F1F1F"/>
           <w:sz w:val="22"/>
         </w:rPr>
-        <w:t>OutilMeteo prend localite, OutilPrix ne prend rien (prix national). Le contrat choisi en Task 1 paie ici.</w:t>
+        <w:t>aucun appel réseau en test ; la source est interchangeable. Aucun LLM tiers — données factuelles uniquement (souveraineté).</w:t>
+      </w:r>
+    </w:p>
+    <w:p>
+      <w:pPr>
+        <w:pStyle w:val="ListBullet"/>
+      </w:pPr>
+      <w:r>
+        <w:rPr>
+          <w:b/>
+          <w:i w:val="0"/>
+          <w:color w:val="EA5B13"/>
+          <w:sz w:val="22"/>
+        </w:rPr>
+        <w:t xml:space="preserve">Fail-soft — </w:t>
+      </w:r>
+      <w:r>
+        <w:rPr>
+          <w:b w:val="0"/>
+          <w:i w:val="0"/>
+          <w:color w:val="1F1F1F"/>
+          <w:sz w:val="22"/>
+        </w:rPr>
+        <w:t>si l'API plante, l'outil renvoie {} au lieu d'exploser ; l'agent dégrade en conseil générique. Un outil qui échoue ne fait jamais tomber l'agent.</w:t>
+      </w:r>
+    </w:p>
+    <w:p>
+      <w:pPr>
+        <w:pStyle w:val="ListBullet"/>
+      </w:pPr>
+      <w:r>
+        <w:rPr>
+          <w:b/>
+          <w:i w:val="0"/>
+          <w:color w:val="EA5B13"/>
+          <w:sz w:val="22"/>
+        </w:rPr>
+        <w:t xml:space="preserve">Routage par mots-clés — </w:t>
+      </w:r>
+      <w:r>
+        <w:rPr>
+          <w:b w:val="0"/>
+          <w:i w:val="0"/>
+          <w:color w:val="1F1F1F"/>
+          <w:sz w:val="22"/>
+        </w:rPr>
+        <w:t>peut_traiter monte avec le nombre de termes climat détectés (0.7 + 0.1 × touches, plafonné à 1.0).</w:t>
       </w:r>
     </w:p>
     <w:p>
@@ -2919,193 +2747,7 @@
           <w:color w:val="EA5B13"/>
           <w:sz w:val="22"/>
         </w:rPr>
-        <w:t>➤ Quand un 2e agent « tool use » se construit en recopiant le 1er, le framework est prouvé. Le reste de la roadmap (10+ agents) est mécanique.</w:t>
-      </w:r>
-    </w:p>
-    <w:p>
-      <w:pPr>
-        <w:pStyle w:val="Heading3"/>
-      </w:pPr>
-      <w:r>
-        <w:rPr>
-          <w:color w:val="EA5B13"/>
-        </w:rPr>
-        <w:t>Ce que les tests verrouillent</w:t>
-      </w:r>
-    </w:p>
-    <w:p>
-      <w:pPr>
-        <w:pStyle w:val="ListBullet"/>
-      </w:pPr>
-      <w:r>
-        <w:rPr>
-          <w:b w:val="0"/>
-          <w:i w:val="0"/>
-          <w:color w:val="1F1F1F"/>
-          <w:sz w:val="22"/>
-        </w:rPr>
-        <w:t>Score élevé sur une question prix, quasi nul sur une question de taille.</w:t>
-      </w:r>
-    </w:p>
-    <w:p>
-      <w:pPr>
-        <w:pStyle w:val="ListBullet"/>
-      </w:pPr>
-      <w:r>
-        <w:rPr>
-          <w:b w:val="0"/>
-          <w:i w:val="0"/>
-          <w:color w:val="1F1F1F"/>
-          <w:sz w:val="22"/>
-        </w:rPr>
-        <w:t>Le cours récupéré (1800 FCFA/kg) est injecté dans le contexte.</w:t>
-      </w:r>
-    </w:p>
-    <w:p>
-      <w:r>
-        <w:br w:type="page"/>
-      </w:r>
-    </w:p>
-    <w:p>
-      <w:pPr>
-        <w:pStyle w:val="Heading1"/>
-      </w:pPr>
-      <w:r>
-        <w:rPr>
-          <w:color w:val="EA5B13"/>
-        </w:rPr>
-        <w:t>8. Synthèse multi-agents — services/agents/agent_reporting.py</w:t>
-      </w:r>
-    </w:p>
-    <w:p>
-      <w:pPr>
-        <w:pStyle w:val="Heading3"/>
-      </w:pPr>
-      <w:r>
-        <w:rPr>
-          <w:color w:val="EA5B13"/>
-        </w:rPr>
-        <w:t>Le concept</w:t>
-      </w:r>
-    </w:p>
-    <w:p>
-      <w:pPr>
-        <w:spacing w:after="120"/>
-      </w:pPr>
-      <w:r>
-        <w:rPr>
-          <w:b w:val="0"/>
-          <w:i w:val="0"/>
-          <w:color w:val="1F1F1F"/>
-          <w:sz w:val="22"/>
-        </w:rPr>
-        <w:t>Jusqu'ici un seul agent répond. L'agent Reporting est différent : il compose la sortie de PLUSIEURS agents (RAG + Météo + Prix) en une synthèse narrative. C'est le premier pas vers l'orchestration multi-agents (plusieurs contributeurs), par opposition au simple routage vers UN agent. Germe des architectures « agent superviseur ».</w:t>
-      </w:r>
-    </w:p>
-    <w:p>
-      <w:pPr>
-        <w:pStyle w:val="Heading3"/>
-      </w:pPr>
-      <w:r>
-        <w:rPr>
-          <w:color w:val="EA5B13"/>
-        </w:rPr>
-        <w:t>Les décisions de conception</w:t>
-      </w:r>
-    </w:p>
-    <w:p>
-      <w:pPr>
-        <w:pStyle w:val="ListBullet"/>
-      </w:pPr>
-      <w:r>
-        <w:rPr>
-          <w:b/>
-          <w:i w:val="0"/>
-          <w:color w:val="EA5B13"/>
-          <w:sz w:val="22"/>
-        </w:rPr>
-        <w:t xml:space="preserve">Construit en dernier — </w:t>
-      </w:r>
-      <w:r>
-        <w:rPr>
-          <w:b w:val="0"/>
-          <w:i w:val="0"/>
-          <w:color w:val="1F1F1F"/>
-          <w:sz w:val="22"/>
-        </w:rPr>
-        <w:t>il dépend des autres : il illustre qu'un agent peut consommer le travail d'agents pairs.</w:t>
-      </w:r>
-    </w:p>
-    <w:p>
-      <w:pPr>
-        <w:pStyle w:val="ListBullet"/>
-      </w:pPr>
-      <w:r>
-        <w:rPr>
-          <w:b/>
-          <w:i w:val="0"/>
-          <w:color w:val="EA5B13"/>
-          <w:sz w:val="22"/>
-        </w:rPr>
-        <w:t xml:space="preserve">Agrégation prudente — </w:t>
-      </w:r>
-      <w:r>
-        <w:rPr>
-          <w:b w:val="0"/>
-          <w:i w:val="0"/>
-          <w:color w:val="1F1F1F"/>
-          <w:sz w:val="22"/>
-        </w:rPr>
-        <w:t>les sources des contributions sont unionnées sans doublon ; la confiance retenue est la plus basse (prudence).</w:t>
-      </w:r>
-    </w:p>
-    <w:p>
-      <w:pPr>
-        <w:pStyle w:val="ListBullet"/>
-      </w:pPr>
-      <w:r>
-        <w:rPr>
-          <w:b/>
-          <w:i w:val="0"/>
-          <w:color w:val="EA5B13"/>
-          <w:sz w:val="22"/>
-        </w:rPr>
-        <w:t xml:space="preserve">Fusion séquentielle simple — </w:t>
-      </w:r>
-      <w:r>
-        <w:rPr>
-          <w:b w:val="0"/>
-          <w:i w:val="0"/>
-          <w:color w:val="1F1F1F"/>
-          <w:sz w:val="22"/>
-        </w:rPr>
-        <w:t>la généralisation fan-out/fan-in (exécution parallèle pilotée par l'orchestrateur) est une évolution V3+ explicitement hors socle.</w:t>
-      </w:r>
-    </w:p>
-    <w:p>
-      <w:pPr>
-        <w:pStyle w:val="Heading3"/>
-      </w:pPr>
-      <w:r>
-        <w:rPr>
-          <w:color w:val="EA5B13"/>
-        </w:rPr>
-        <w:t>Modèle mental</w:t>
-      </w:r>
-    </w:p>
-    <w:p>
-      <w:pPr>
-        <w:spacing w:after="160"/>
-        <w:ind w:left="240"/>
-      </w:pPr>
-      <w:r>
-        <w:rPr>
-          <w:b w:val="0"/>
-          <w:i/>
-          <w:color w:val="EA5B13"/>
-          <w:sz w:val="22"/>
-        </w:rPr>
-        <w:t>➤ Le routage choisit QUI parle ; la synthèse fait PARLER ENSEMBLE. C'est la bascule du mono-agent vers le multi-agents.</w:t>
+        <w:t>➤ L'outil = les yeux et les mains de l'agent sur le monde réel. L'agent = le cerveau qui décide quoi en faire.</w:t>
       </w:r>
     </w:p>
     <w:p>
@@ -3130,7 +2772,7 @@
           <w:color w:val="606060"/>
           <w:sz w:val="20"/>
         </w:rPr>
-        <w:t>synthetiser (extrait) :</w:t>
+        <w:t>L'agent récupère puis injecte (extrait) :</w:t>
       </w:r>
     </w:p>
     <w:p>
@@ -3147,7 +2789,7 @@
           <w:color w:val="1F1F1F"/>
           <w:sz w:val="18"/>
         </w:rPr>
-        <w:t>async def synthetiser(self, requete, contributions: list[AgentReponse]) -&gt; AgentReponse:</w:t>
+        <w:t>async def traiter(self, requete) -&gt; AgentReponse:</w:t>
       </w:r>
       <w:r>
         <w:rPr>
@@ -3158,7 +2800,7 @@
           <w:sz w:val="18"/>
         </w:rPr>
         <w:br/>
-        <w:t xml:space="preserve">    contexte = _formater_contributions(contributions)   # « [meteo] … / [prix] … »</w:t>
+        <w:t xml:space="preserve">    localite = _detecter_localite(requete.fil_ancre) or self._geo_defaut</w:t>
       </w:r>
       <w:r>
         <w:rPr>
@@ -3169,7 +2811,7 @@
           <w:sz w:val="18"/>
         </w:rPr>
         <w:br/>
-        <w:t xml:space="preserve">    base = await self._generer(requete, contexte)        # le LLM rédige la synthèse</w:t>
+        <w:t xml:space="preserve">    previsions = await self._outil.invoquer(localite=localite)  # tool use</w:t>
       </w:r>
       <w:r>
         <w:rPr>
@@ -3180,7 +2822,7 @@
           <w:sz w:val="18"/>
         </w:rPr>
         <w:br/>
-        <w:t xml:space="preserve">    return AgentReponse(base.texte, _agréger_sources(contributions),</w:t>
+        <w:t xml:space="preserve">    contexte = _formater_previsions(localite, previsions)</w:t>
       </w:r>
       <w:r>
         <w:rPr>
@@ -3191,7 +2833,7 @@
           <w:sz w:val="18"/>
         </w:rPr>
         <w:br/>
-        <w:t xml:space="preserve">        _confiance_min(contributions) or base.confiance, agent="reporting")</w:t>
+        <w:t xml:space="preserve">    return await self._generer(requete, contexte)  # le LLM raisonne sur les faits</w:t>
       </w:r>
     </w:p>
     <w:p>
@@ -3216,7 +2858,7 @@
           <w:color w:val="1F1F1F"/>
           <w:sz w:val="22"/>
         </w:rPr>
-        <w:t>peut_traiter élevé sur une demande de bilan/synthèse.</w:t>
+        <w:t>Score élevé sur une question météo, quasi nul sur une question prix.</w:t>
       </w:r>
     </w:p>
     <w:p>
@@ -3230,12 +2872,39 @@
           <w:color w:val="1F1F1F"/>
           <w:sz w:val="22"/>
         </w:rPr>
-        <w:t>Les contributions sont passées au LLM comme contexte de synthèse.</w:t>
+        <w:t>Les prévisions récupérées sont bien injectées dans le contexte passé au LLM.</w:t>
       </w:r>
     </w:p>
     <w:p>
-      <w:pPr>
-        <w:pStyle w:val="ListBullet"/>
+      <w:r>
+        <w:br w:type="page"/>
+      </w:r>
+    </w:p>
+    <w:p>
+      <w:pPr>
+        <w:pStyle w:val="Heading1"/>
+      </w:pPr>
+      <w:r>
+        <w:rPr>
+          <w:color w:val="EA5B13"/>
+        </w:rPr>
+        <w:t>7. Réplication du pattern — services/outils/prix.py + agent_prix.py</w:t>
+      </w:r>
+    </w:p>
+    <w:p>
+      <w:pPr>
+        <w:pStyle w:val="Heading3"/>
+      </w:pPr>
+      <w:r>
+        <w:rPr>
+          <w:color w:val="EA5B13"/>
+        </w:rPr>
+        <w:t>Le concept</w:t>
+      </w:r>
+    </w:p>
+    <w:p>
+      <w:pPr>
+        <w:spacing w:after="120"/>
       </w:pPr>
       <w:r>
         <w:rPr>
@@ -3244,40 +2913,33 @@
           <w:color w:val="1F1F1F"/>
           <w:sz w:val="22"/>
         </w:rPr>
-        <w:t>Les sources des contributions sont agrégées dans la réponse finale.</w:t>
+        <w:t>L'agent Prix est le jumeau de l'agent Météo : même moule (outil + port mockable + injection de contexte), domaine différent (prix/marché du cacao). Sa valeur pédagogique : prouver que le framework tient.</w:t>
       </w:r>
     </w:p>
     <w:p>
-      <w:r>
-        <w:br w:type="page"/>
+      <w:pPr>
+        <w:pStyle w:val="Heading3"/>
+      </w:pPr>
+      <w:r>
+        <w:rPr>
+          <w:color w:val="EA5B13"/>
+        </w:rPr>
+        <w:t>Les décisions de conception</w:t>
       </w:r>
     </w:p>
     <w:p>
       <w:pPr>
-        <w:pStyle w:val="Heading1"/>
-      </w:pPr>
-      <w:r>
-        <w:rPr>
+        <w:pStyle w:val="ListBullet"/>
+      </w:pPr>
+      <w:r>
+        <w:rPr>
+          <w:b/>
+          <w:i w:val="0"/>
           <w:color w:val="EA5B13"/>
-        </w:rPr>
-        <w:t>9. Câblage derrière un flag — config, api_deps, router</w:t>
-      </w:r>
-    </w:p>
-    <w:p>
-      <w:pPr>
-        <w:pStyle w:val="Heading3"/>
-      </w:pPr>
-      <w:r>
-        <w:rPr>
-          <w:color w:val="EA5B13"/>
-        </w:rPr>
-        <w:t>Le concept</w:t>
-      </w:r>
-    </w:p>
-    <w:p>
-      <w:pPr>
-        <w:spacing w:after="120"/>
-      </w:pPr>
+          <w:sz w:val="22"/>
+        </w:rPr>
+        <w:t xml:space="preserve">Coût marginal faible et constant — </w:t>
+      </w:r>
       <w:r>
         <w:rPr>
           <w:b w:val="0"/>
@@ -3285,18 +2947,7 @@
           <w:color w:val="1F1F1F"/>
           <w:sz w:val="22"/>
         </w:rPr>
-        <w:t>Une plateforme agentique se met en service progressivement. On l'expose derrière agents_enabled (OFF par défaut) : tant qu'il est OFF, la V2 reste seule en production. La composition racine (api_deps) est le seul endroit où l'on ASSEMBLE le graphe d'objets : créer le registre, instancier chaque agent avec ses ports, les enregistrer, construire le routeur puis l'orchestrateur.</w:t>
-      </w:r>
-    </w:p>
-    <w:p>
-      <w:pPr>
-        <w:pStyle w:val="Heading3"/>
-      </w:pPr>
-      <w:r>
-        <w:rPr>
-          <w:color w:val="EA5B13"/>
-        </w:rPr>
-        <w:t>Les décisions de conception</w:t>
+        <w:t>le test d'un bon socle : ajouter l'agent n°5..n°11 = recopier le moule en changeant le domaine.</w:t>
       </w:r>
     </w:p>
     <w:p>
@@ -3310,7 +2961,7 @@
           <w:color w:val="EA5B13"/>
           <w:sz w:val="22"/>
         </w:rPr>
-        <w:t xml:space="preserve">Feature flag — </w:t>
+        <w:t xml:space="preserve">invoquer(**kwargs) absorbe la différence — </w:t>
       </w:r>
       <w:r>
         <w:rPr>
@@ -3319,7 +2970,124 @@
           <w:color w:val="1F1F1F"/>
           <w:sz w:val="22"/>
         </w:rPr>
-        <w:t>bascule V2↔V3 sans risque ; rollback instantané.</w:t>
+        <w:t>OutilMeteo prend localite, OutilPrix ne prend rien (prix national). Le contrat choisi en Task 1 paie ici.</w:t>
+      </w:r>
+    </w:p>
+    <w:p>
+      <w:pPr>
+        <w:pStyle w:val="Heading3"/>
+      </w:pPr>
+      <w:r>
+        <w:rPr>
+          <w:color w:val="EA5B13"/>
+        </w:rPr>
+        <w:t>Modèle mental</w:t>
+      </w:r>
+    </w:p>
+    <w:p>
+      <w:pPr>
+        <w:spacing w:after="160"/>
+        <w:ind w:left="240"/>
+      </w:pPr>
+      <w:r>
+        <w:rPr>
+          <w:b w:val="0"/>
+          <w:i/>
+          <w:color w:val="EA5B13"/>
+          <w:sz w:val="22"/>
+        </w:rPr>
+        <w:t>➤ Quand un 2e agent « tool use » se construit en recopiant le 1er, le framework est prouvé. Le reste de la roadmap (10+ agents) est mécanique.</w:t>
+      </w:r>
+    </w:p>
+    <w:p>
+      <w:pPr>
+        <w:pStyle w:val="Heading3"/>
+      </w:pPr>
+      <w:r>
+        <w:rPr>
+          <w:color w:val="EA5B13"/>
+        </w:rPr>
+        <w:t>Ce que les tests verrouillent</w:t>
+      </w:r>
+    </w:p>
+    <w:p>
+      <w:pPr>
+        <w:pStyle w:val="ListBullet"/>
+      </w:pPr>
+      <w:r>
+        <w:rPr>
+          <w:b w:val="0"/>
+          <w:i w:val="0"/>
+          <w:color w:val="1F1F1F"/>
+          <w:sz w:val="22"/>
+        </w:rPr>
+        <w:t>Score élevé sur une question prix, quasi nul sur une question de taille.</w:t>
+      </w:r>
+    </w:p>
+    <w:p>
+      <w:pPr>
+        <w:pStyle w:val="ListBullet"/>
+      </w:pPr>
+      <w:r>
+        <w:rPr>
+          <w:b w:val="0"/>
+          <w:i w:val="0"/>
+          <w:color w:val="1F1F1F"/>
+          <w:sz w:val="22"/>
+        </w:rPr>
+        <w:t>Le cours récupéré (1800 FCFA/kg) est injecté dans le contexte.</w:t>
+      </w:r>
+    </w:p>
+    <w:p>
+      <w:r>
+        <w:br w:type="page"/>
+      </w:r>
+    </w:p>
+    <w:p>
+      <w:pPr>
+        <w:pStyle w:val="Heading1"/>
+      </w:pPr>
+      <w:r>
+        <w:rPr>
+          <w:color w:val="EA5B13"/>
+        </w:rPr>
+        <w:t>8. Synthèse multi-agents — services/agents/agent_reporting.py</w:t>
+      </w:r>
+    </w:p>
+    <w:p>
+      <w:pPr>
+        <w:pStyle w:val="Heading3"/>
+      </w:pPr>
+      <w:r>
+        <w:rPr>
+          <w:color w:val="EA5B13"/>
+        </w:rPr>
+        <w:t>Le concept</w:t>
+      </w:r>
+    </w:p>
+    <w:p>
+      <w:pPr>
+        <w:spacing w:after="120"/>
+      </w:pPr>
+      <w:r>
+        <w:rPr>
+          <w:b w:val="0"/>
+          <w:i w:val="0"/>
+          <w:color w:val="1F1F1F"/>
+          <w:sz w:val="22"/>
+        </w:rPr>
+        <w:t>Jusqu'ici un seul agent répond. L'agent Reporting est différent : il compose la sortie de PLUSIEURS agents (RAG + Météo + Prix) en une synthèse narrative. C'est le premier pas vers l'orchestration multi-agents (plusieurs contributeurs), par opposition au simple routage vers UN agent. Germe des architectures « agent superviseur ».</w:t>
+      </w:r>
+    </w:p>
+    <w:p>
+      <w:pPr>
+        <w:pStyle w:val="Heading3"/>
+      </w:pPr>
+      <w:r>
+        <w:rPr>
+          <w:color w:val="EA5B13"/>
+        </w:rPr>
+        <w:t>Les décisions de conception</w:t>
       </w:r>
     </w:p>
     <w:p>
@@ -3333,7 +3101,7 @@
           <w:color w:val="EA5B13"/>
           <w:sz w:val="22"/>
         </w:rPr>
-        <w:t xml:space="preserve">Composition root — </w:t>
+        <w:t xml:space="preserve">Construit en dernier — </w:t>
       </w:r>
       <w:r>
         <w:rPr>
@@ -3342,7 +3110,7 @@
           <w:color w:val="1F1F1F"/>
           <w:sz w:val="22"/>
         </w:rPr>
-        <w:t>tout le câblage en un lieu ; le reste du code n'en sait rien.</w:t>
+        <w:t>il dépend des autres : il illustre qu'un agent peut consommer le travail d'agents pairs.</w:t>
       </w:r>
     </w:p>
     <w:p>
@@ -3356,7 +3124,7 @@
           <w:color w:val="EA5B13"/>
           <w:sz w:val="22"/>
         </w:rPr>
-        <w:t xml:space="preserve">Branchement via get_dialogue_service — </w:t>
+        <w:t xml:space="preserve">Agrégation prudente — </w:t>
       </w:r>
       <w:r>
         <w:rPr>
@@ -3365,7 +3133,7 @@
           <w:color w:val="1F1F1F"/>
           <w:sz w:val="22"/>
         </w:rPr>
-        <w:t>le router POST passe par la gestion de sessions V2, PAS directement par le handler HTTP : on insère l'orchestrateur à ce niveau pour conserver les sessions conversationnelles.</w:t>
+        <w:t>les sources des contributions sont unionnées sans doublon ; la confiance retenue est la plus basse (prudence).</w:t>
       </w:r>
     </w:p>
     <w:p>
@@ -3379,7 +3147,7 @@
           <w:color w:val="EA5B13"/>
           <w:sz w:val="22"/>
         </w:rPr>
-        <w:t xml:space="preserve">Outils « indisponibles » — </w:t>
+        <w:t xml:space="preserve">Fusion séquentielle simple — </w:t>
       </w:r>
       <w:r>
         <w:rPr>
@@ -3388,7 +3156,18 @@
           <w:color w:val="1F1F1F"/>
           <w:sz w:val="22"/>
         </w:rPr>
-        <w:t>Météo/Prix sont enregistrés avec un adaptateur neutre ({}) tant qu'aucune API réelle n'est branchée ; l'agent dégrade en conseil générique. Le socle reste 100 % testable et déployable sans dépendance externe.</w:t>
+        <w:t>la généralisation fan-out/fan-in (exécution parallèle pilotée par l'orchestrateur) est une évolution V3+ explicitement hors socle.</w:t>
+      </w:r>
+    </w:p>
+    <w:p>
+      <w:pPr>
+        <w:pStyle w:val="Heading3"/>
+      </w:pPr>
+      <w:r>
+        <w:rPr>
+          <w:color w:val="EA5B13"/>
+        </w:rPr>
+        <w:t>Modèle mental</w:t>
       </w:r>
     </w:p>
     <w:p>
@@ -3403,28 +3182,109 @@
           <w:color w:val="EA5B13"/>
           <w:sz w:val="22"/>
         </w:rPr>
-        <w:t>➤ Livrer sans casser : flag OFF + composition root unique. La V3 s'insère dans la V2, elle ne la remplace pas.</w:t>
+        <w:t>➤ Le routage choisit QUI parle ; la synthèse fait PARLER ENSEMBLE. C'est la bascule du mono-agent vers le multi-agents.</w:t>
       </w:r>
     </w:p>
     <w:p>
-      <w:r>
-        <w:br w:type="page"/>
+      <w:pPr>
+        <w:pStyle w:val="Heading3"/>
+      </w:pPr>
+      <w:r>
+        <w:rPr>
+          <w:color w:val="EA5B13"/>
+        </w:rPr>
+        <w:t>Code</w:t>
       </w:r>
     </w:p>
     <w:p>
       <w:pPr>
-        <w:pStyle w:val="Heading1"/>
-      </w:pPr>
-      <w:r>
-        <w:rPr>
-          <w:color w:val="EA5B13"/>
-        </w:rPr>
-        <w:t>Recette — Ajouter un agent en 4 étapes</w:t>
+        <w:spacing w:after="40"/>
+      </w:pPr>
+      <w:r>
+        <w:rPr>
+          <w:b w:val="0"/>
+          <w:i/>
+          <w:color w:val="606060"/>
+          <w:sz w:val="20"/>
+        </w:rPr>
+        <w:t>synthetiser (extrait) :</w:t>
       </w:r>
     </w:p>
     <w:p>
       <w:pPr>
-        <w:spacing w:after="120"/>
+        <w:spacing w:before="80" w:after="160"/>
+        <w:ind w:left="160"/>
+        <w:shd w:val="clear" w:fill="F2F2F2"/>
+      </w:pPr>
+      <w:r>
+        <w:rPr>
+          <w:rFonts w:ascii="Consolas" w:hAnsi="Consolas"/>
+          <w:b w:val="0"/>
+          <w:i w:val="0"/>
+          <w:color w:val="1F1F1F"/>
+          <w:sz w:val="18"/>
+        </w:rPr>
+        <w:t>async def synthetiser(self, requete, contributions: list[AgentReponse]) -&gt; AgentReponse:</w:t>
+      </w:r>
+      <w:r>
+        <w:rPr>
+          <w:rFonts w:ascii="Consolas" w:hAnsi="Consolas"/>
+          <w:b w:val="0"/>
+          <w:i w:val="0"/>
+          <w:color w:val="1F1F1F"/>
+          <w:sz w:val="18"/>
+        </w:rPr>
+        <w:br/>
+        <w:t xml:space="preserve">    contexte = _formater_contributions(contributions)   # « [meteo] … / [prix] … »</w:t>
+      </w:r>
+      <w:r>
+        <w:rPr>
+          <w:rFonts w:ascii="Consolas" w:hAnsi="Consolas"/>
+          <w:b w:val="0"/>
+          <w:i w:val="0"/>
+          <w:color w:val="1F1F1F"/>
+          <w:sz w:val="18"/>
+        </w:rPr>
+        <w:br/>
+        <w:t xml:space="preserve">    base = await self._generer(requete, contexte)        # le LLM rédige la synthèse</w:t>
+      </w:r>
+      <w:r>
+        <w:rPr>
+          <w:rFonts w:ascii="Consolas" w:hAnsi="Consolas"/>
+          <w:b w:val="0"/>
+          <w:i w:val="0"/>
+          <w:color w:val="1F1F1F"/>
+          <w:sz w:val="18"/>
+        </w:rPr>
+        <w:br/>
+        <w:t xml:space="preserve">    return AgentReponse(base.texte, _agréger_sources(contributions),</w:t>
+      </w:r>
+      <w:r>
+        <w:rPr>
+          <w:rFonts w:ascii="Consolas" w:hAnsi="Consolas"/>
+          <w:b w:val="0"/>
+          <w:i w:val="0"/>
+          <w:color w:val="1F1F1F"/>
+          <w:sz w:val="18"/>
+        </w:rPr>
+        <w:br/>
+        <w:t xml:space="preserve">        _confiance_min(contributions) or base.confiance, agent="reporting")</w:t>
+      </w:r>
+    </w:p>
+    <w:p>
+      <w:pPr>
+        <w:pStyle w:val="Heading3"/>
+      </w:pPr>
+      <w:r>
+        <w:rPr>
+          <w:color w:val="EA5B13"/>
+        </w:rPr>
+        <w:t>Ce que les tests verrouillent</w:t>
+      </w:r>
+    </w:p>
+    <w:p>
+      <w:pPr>
+        <w:pStyle w:val="ListBullet"/>
       </w:pPr>
       <w:r>
         <w:rPr>
@@ -3433,12 +3293,92 @@
           <w:color w:val="1F1F1F"/>
           <w:sz w:val="22"/>
         </w:rPr>
-        <w:t>C'est l'aboutissement du socle : l'extensibilité prouvée. Pour ajouter l'agent n°5 (ex. Maladie, Satellite, Réglementation…) :</w:t>
+        <w:t>peut_traiter élevé sur une demande de bilan/synthèse.</w:t>
       </w:r>
     </w:p>
     <w:p>
       <w:pPr>
-        <w:pStyle w:val="ListNumber"/>
+        <w:pStyle w:val="ListBullet"/>
+      </w:pPr>
+      <w:r>
+        <w:rPr>
+          <w:b w:val="0"/>
+          <w:i w:val="0"/>
+          <w:color w:val="1F1F1F"/>
+          <w:sz w:val="22"/>
+        </w:rPr>
+        <w:t>Les contributions sont passées au LLM comme contexte de synthèse.</w:t>
+      </w:r>
+    </w:p>
+    <w:p>
+      <w:pPr>
+        <w:pStyle w:val="ListBullet"/>
+      </w:pPr>
+      <w:r>
+        <w:rPr>
+          <w:b w:val="0"/>
+          <w:i w:val="0"/>
+          <w:color w:val="1F1F1F"/>
+          <w:sz w:val="22"/>
+        </w:rPr>
+        <w:t>Les sources des contributions sont agrégées dans la réponse finale.</w:t>
+      </w:r>
+    </w:p>
+    <w:p>
+      <w:r>
+        <w:br w:type="page"/>
+      </w:r>
+    </w:p>
+    <w:p>
+      <w:pPr>
+        <w:pStyle w:val="Heading1"/>
+      </w:pPr>
+      <w:r>
+        <w:rPr>
+          <w:color w:val="EA5B13"/>
+        </w:rPr>
+        <w:t>9. Câblage derrière un flag — config, api_deps, router</w:t>
+      </w:r>
+    </w:p>
+    <w:p>
+      <w:pPr>
+        <w:pStyle w:val="Heading3"/>
+      </w:pPr>
+      <w:r>
+        <w:rPr>
+          <w:color w:val="EA5B13"/>
+        </w:rPr>
+        <w:t>Le concept</w:t>
+      </w:r>
+    </w:p>
+    <w:p>
+      <w:pPr>
+        <w:spacing w:after="120"/>
+      </w:pPr>
+      <w:r>
+        <w:rPr>
+          <w:b w:val="0"/>
+          <w:i w:val="0"/>
+          <w:color w:val="1F1F1F"/>
+          <w:sz w:val="22"/>
+        </w:rPr>
+        <w:t>Une plateforme agentique se met en service progressivement. On l'expose derrière agents_enabled (OFF par défaut) : tant qu'il est OFF, la V2 reste seule en production. La composition racine (api_deps) est le seul endroit où l'on ASSEMBLE le graphe d'objets : créer le registre, instancier chaque agent avec ses ports, les enregistrer, construire le routeur puis l'orchestrateur.</w:t>
+      </w:r>
+    </w:p>
+    <w:p>
+      <w:pPr>
+        <w:pStyle w:val="Heading3"/>
+      </w:pPr>
+      <w:r>
+        <w:rPr>
+          <w:color w:val="EA5B13"/>
+        </w:rPr>
+        <w:t>Les décisions de conception</w:t>
+      </w:r>
+    </w:p>
+    <w:p>
+      <w:pPr>
+        <w:pStyle w:val="ListBullet"/>
       </w:pPr>
       <w:r>
         <w:rPr>
@@ -3447,7 +3387,7 @@
           <w:color w:val="EA5B13"/>
           <w:sz w:val="22"/>
         </w:rPr>
-        <w:t xml:space="preserve">Écrire l'agent — </w:t>
+        <w:t xml:space="preserve">Feature flag — </w:t>
       </w:r>
       <w:r>
         <w:rPr>
@@ -3456,12 +3396,12 @@
           <w:color w:val="1F1F1F"/>
           <w:sz w:val="22"/>
         </w:rPr>
-        <w:t>services/agents/agent_maladie.py héritant d'AgentBase, avec nom, description, mots_cles, peut_traiter(), traiter().</w:t>
+        <w:t>bascule V2↔V3 sans risque ; rollback instantané.</w:t>
       </w:r>
     </w:p>
     <w:p>
       <w:pPr>
-        <w:pStyle w:val="ListNumber"/>
+        <w:pStyle w:val="ListBullet"/>
       </w:pPr>
       <w:r>
         <w:rPr>
@@ -3470,7 +3410,7 @@
           <w:color w:val="EA5B13"/>
           <w:sz w:val="22"/>
         </w:rPr>
-        <w:t xml:space="preserve">(Si besoin) un outil — </w:t>
+        <w:t xml:space="preserve">Composition root — </w:t>
       </w:r>
       <w:r>
         <w:rPr>
@@ -3479,12 +3419,12 @@
           <w:color w:val="1F1F1F"/>
           <w:sz w:val="22"/>
         </w:rPr>
-        <w:t>services/outils/maladie.py + un MaladiePort mockable, sur le moule de meteo.py/prix.py.</w:t>
+        <w:t>tout le câblage en un lieu ; le reste du code n'en sait rien.</w:t>
       </w:r>
     </w:p>
     <w:p>
       <w:pPr>
-        <w:pStyle w:val="ListNumber"/>
+        <w:pStyle w:val="ListBullet"/>
       </w:pPr>
       <w:r>
         <w:rPr>
@@ -3493,7 +3433,7 @@
           <w:color w:val="EA5B13"/>
           <w:sz w:val="22"/>
         </w:rPr>
-        <w:t xml:space="preserve">L'enregistrer — </w:t>
+        <w:t xml:space="preserve">Branchement via get_dialogue_service — </w:t>
       </w:r>
       <w:r>
         <w:rPr>
@@ -3502,12 +3442,12 @@
           <w:color w:val="1F1F1F"/>
           <w:sz w:val="22"/>
         </w:rPr>
-        <w:t>une ligne dans _construire_orchestrateur (api_deps) : registre.enregistrer(AgentMaladie(...)).</w:t>
+        <w:t>le router POST passe par la gestion de sessions V2, PAS directement par le handler HTTP : on insère l'orchestrateur à ce niveau pour conserver les sessions conversationnelles.</w:t>
       </w:r>
     </w:p>
     <w:p>
       <w:pPr>
-        <w:pStyle w:val="ListNumber"/>
+        <w:pStyle w:val="ListBullet"/>
       </w:pPr>
       <w:r>
         <w:rPr>
@@ -3516,7 +3456,7 @@
           <w:color w:val="EA5B13"/>
           <w:sz w:val="22"/>
         </w:rPr>
-        <w:t xml:space="preserve">Tester — </w:t>
+        <w:t xml:space="preserve">Outils « indisponibles » — </w:t>
       </w:r>
       <w:r>
         <w:rPr>
@@ -3525,7 +3465,144 @@
           <w:color w:val="1F1F1F"/>
           <w:sz w:val="22"/>
         </w:rPr>
-        <w:t>api/tests/agents/test_agent_maladie.py (routage + injection de contexte), en TDD.</w:t>
+        <w:t>Météo/Prix sont enregistrés avec un adaptateur neutre ({}) tant qu'aucune API réelle n'est branchée ; l'agent dégrade en conseil générique. Le socle reste 100 % testable et déployable sans dépendance externe.</w:t>
+      </w:r>
+    </w:p>
+    <w:p>
+      <w:pPr>
+        <w:spacing w:after="160"/>
+        <w:ind w:left="240"/>
+      </w:pPr>
+      <w:r>
+        <w:rPr>
+          <w:b w:val="0"/>
+          <w:i/>
+          <w:color w:val="EA5B13"/>
+          <w:sz w:val="22"/>
+        </w:rPr>
+        <w:t>➤ Livrer sans casser : flag OFF + composition root unique. La V3 s'insère dans la V2, elle ne la remplace pas.</w:t>
+      </w:r>
+    </w:p>
+    <w:p>
+      <w:r>
+        <w:br w:type="page"/>
+      </w:r>
+    </w:p>
+    <w:p>
+      <w:pPr>
+        <w:pStyle w:val="Heading1"/>
+      </w:pPr>
+      <w:r>
+        <w:rPr>
+          <w:color w:val="EA5B13"/>
+        </w:rPr>
+        <w:t>Recette — Ajouter un agent en 4 étapes (appliquée à l'agent EUDR)</w:t>
+      </w:r>
+    </w:p>
+    <w:p>
+      <w:pPr>
+        <w:spacing w:after="120"/>
+      </w:pPr>
+      <w:r>
+        <w:rPr>
+          <w:b w:val="0"/>
+          <w:i w:val="0"/>
+          <w:color w:val="1F1F1F"/>
+          <w:sz w:val="22"/>
+        </w:rPr>
+        <w:t>C'est l'aboutissement du socle : l'extensibilité prouvée. L'agent n°5 — Réglementation EUDR — a été ajouté en suivant exactement cette recette :</w:t>
+      </w:r>
+    </w:p>
+    <w:p>
+      <w:pPr>
+        <w:pStyle w:val="ListNumber"/>
+      </w:pPr>
+      <w:r>
+        <w:rPr>
+          <w:b/>
+          <w:i w:val="0"/>
+          <w:color w:val="EA5B13"/>
+          <w:sz w:val="22"/>
+        </w:rPr>
+        <w:t xml:space="preserve">Écrire l'agent — </w:t>
+      </w:r>
+      <w:r>
+        <w:rPr>
+          <w:b w:val="0"/>
+          <w:i w:val="0"/>
+          <w:color w:val="1F1F1F"/>
+          <w:sz w:val="22"/>
+        </w:rPr>
+        <w:t>services/agents/agent_reglementation.py héritant d'AgentBase : nom="reglementation", mots_cles (eudr, déforestation, traçabilité, export…), peut_traiter() (routage par mot entier), traiter() (préfixe un cadrage EUDR au contexte RAG).</w:t>
+      </w:r>
+    </w:p>
+    <w:p>
+      <w:pPr>
+        <w:pStyle w:val="ListNumber"/>
+      </w:pPr>
+      <w:r>
+        <w:rPr>
+          <w:b/>
+          <w:i w:val="0"/>
+          <w:color w:val="EA5B13"/>
+          <w:sz w:val="22"/>
+        </w:rPr>
+        <w:t xml:space="preserve">(Si besoin) un outil — </w:t>
+      </w:r>
+      <w:r>
+        <w:rPr>
+          <w:b w:val="0"/>
+          <w:i w:val="0"/>
+          <w:color w:val="1F1F1F"/>
+          <w:sz w:val="22"/>
+        </w:rPr>
+        <w:t>non nécessaire ici : l'agent réutilise le récupérateur RAG. Pour un agent à données externes, on ajouterait services/outils/&lt;x&gt;.py + un port mockable (moule meteo.py/prix.py).</w:t>
+      </w:r>
+    </w:p>
+    <w:p>
+      <w:pPr>
+        <w:pStyle w:val="ListNumber"/>
+      </w:pPr>
+      <w:r>
+        <w:rPr>
+          <w:b/>
+          <w:i w:val="0"/>
+          <w:color w:val="EA5B13"/>
+          <w:sz w:val="22"/>
+        </w:rPr>
+        <w:t xml:space="preserve">L'enregistrer — </w:t>
+      </w:r>
+      <w:r>
+        <w:rPr>
+          <w:b w:val="0"/>
+          <w:i w:val="0"/>
+          <w:color w:val="1F1F1F"/>
+          <w:sz w:val="22"/>
+        </w:rPr>
+        <w:t>UNE SEULE ligne dans _construire_orchestrateur (api_deps) : registre.enregistrer(AgentReglementation(inference, rag=rag)).</w:t>
+      </w:r>
+    </w:p>
+    <w:p>
+      <w:pPr>
+        <w:pStyle w:val="ListNumber"/>
+      </w:pPr>
+      <w:r>
+        <w:rPr>
+          <w:b/>
+          <w:i w:val="0"/>
+          <w:color w:val="EA5B13"/>
+          <w:sz w:val="22"/>
+        </w:rPr>
+        <w:t xml:space="preserve">Tester — </w:t>
+      </w:r>
+      <w:r>
+        <w:rPr>
+          <w:b w:val="0"/>
+          <w:i w:val="0"/>
+          <w:color w:val="1F1F1F"/>
+          <w:sz w:val="22"/>
+        </w:rPr>
+        <w:t>api/tests/agents/test_agent_reglementation.py (routage + cadrage injecté), en TDD.</w:t>
       </w:r>
     </w:p>
     <w:p>
@@ -3539,7 +3616,7 @@
           <w:color w:val="606060"/>
           <w:sz w:val="22"/>
         </w:rPr>
-        <w:t>AUCUNE autre modification. L'orchestrateur, le registre et le routeur restent intacts. C'est la définition opérationnelle d'« ouvert à l'extension, fermé à la modification ».</w:t>
+        <w:t>AUCUNE autre modification. L'orchestrateur, le registre et le routeur sont restés intacts — preuve concrète d'« ouvert à l'extension, fermé à la modification ». Les agents suivants (Maladie, Satellite, Normes, ERP…) suivront le même moule.</w:t>
       </w:r>
     </w:p>
     <w:p>
@@ -3700,7 +3777,21 @@
           <w:color w:val="1F1F1F"/>
           <w:sz w:val="22"/>
         </w:rPr>
-        <w:t>Le socle est sûr et dormant (flag OFF, V2 inchangée). Mais l'activer en l'état dégraderait l'expérience par rapport à la V2 : le chemin agentique n'a pas encore la parité fonctionnelle. À traiter avant tout rollout (revue adversariale du 29/06/2026) :</w:t>
+        <w:t>Le socle est sûr et dormant (flag OFF, V2 inchangée). La parité fonctionnelle progresse ; état au 29/06/2026 :</w:t>
+      </w:r>
+    </w:p>
+    <w:p>
+      <w:pPr>
+        <w:spacing w:after="120"/>
+      </w:pPr>
+      <w:r>
+        <w:rPr>
+          <w:b w:val="0"/>
+          <w:i w:val="0"/>
+          <w:color w:val="EA5B13"/>
+          <w:sz w:val="22"/>
+        </w:rPr>
+        <w:t>Fait (parité V2 dans l'orchestrateur) :</w:t>
       </w:r>
     </w:p>
     <w:p>
@@ -3714,7 +3805,7 @@
           <w:color w:val="EA5B13"/>
           <w:sz w:val="22"/>
         </w:rPr>
-        <w:t xml:space="preserve">Parité features V2 — </w:t>
+        <w:t xml:space="preserve">Enrichissement contact ANADER + clarification — </w:t>
       </w:r>
       <w:r>
         <w:rPr>
@@ -3723,7 +3814,7 @@
           <w:color w:val="1F1F1F"/>
           <w:sz w:val="22"/>
         </w:rPr>
-        <w:t>l'orchestrateur ne fait pas encore l'enrichissement contact ANADER ni la clarification consultative que la V2 applique. Un agent ne doit pas faire disparaître ces features validées.</w:t>
+        <w:t>l'orchestrateur applique clarification.analyser (avant dispatch) et conseil_commun.enrichir_contact (sur chaque réponse), comme la V2. Mutualisé dans application/conseil_commun.py.</w:t>
       </w:r>
     </w:p>
     <w:p>
@@ -3737,7 +3828,7 @@
           <w:color w:val="EA5B13"/>
           <w:sz w:val="22"/>
         </w:rPr>
-        <w:t xml:space="preserve">Cache de réponses — </w:t>
+        <w:t xml:space="preserve">Cache exact de réponses — </w:t>
       </w:r>
       <w:r>
         <w:rPr>
@@ -3746,7 +3837,44 @@
           <w:color w:val="1F1F1F"/>
           <w:sz w:val="22"/>
         </w:rPr>
-        <w:t>l'orchestrateur n'utilise le cache que pour le rate-limit. Brancher get_cached/set_cached (et le préchauffage), sinon chaque tour relance l'inférence (~38 s CPU).</w:t>
+        <w:t>get_cached/set_cached branchés (tour unique), sérialisation partagée avec la V2 -&gt; le pré-chauffage redevient utile, latence préservée.</w:t>
+      </w:r>
+    </w:p>
+    <w:p>
+      <w:pPr>
+        <w:spacing w:after="120"/>
+      </w:pPr>
+      <w:r>
+        <w:rPr>
+          <w:b w:val="0"/>
+          <w:i w:val="0"/>
+          <w:color w:val="EA5B13"/>
+          <w:sz w:val="22"/>
+        </w:rPr>
+        <w:t>Reste avant agents_enabled = ON :</w:t>
+      </w:r>
+    </w:p>
+    <w:p>
+      <w:pPr>
+        <w:pStyle w:val="ListBullet"/>
+      </w:pPr>
+      <w:r>
+        <w:rPr>
+          <w:b/>
+          <w:i w:val="0"/>
+          <w:color w:val="EA5B13"/>
+          <w:sz w:val="22"/>
+        </w:rPr>
+        <w:t xml:space="preserve">Cache sémantique — </w:t>
+      </w:r>
+      <w:r>
+        <w:rPr>
+          <w:b w:val="0"/>
+          <w:i w:val="0"/>
+          <w:color w:val="1F1F1F"/>
+          <w:sz w:val="22"/>
+        </w:rPr>
+        <w:t>seul l'exact-match est branché (le sémantique nécessite le port embeddings).</w:t>
       </w:r>
     </w:p>
     <w:p>

</xml_diff>

<commit_message>
feat(agents): vrai streaming token-par-token sur le chemin agentique
AgentBase expose traiter_stream (chaque agent ne définit que _contexte) ; Orchestrateur.traiter_stream streame les fragments avec garde-fou de sortie phrase par phrase (application/flux.py : FiltreSortie, evenement_final), puis enrichissement contact + événement final. L'adaptateur conseiller_stream y délègue -> affichage progressif identique à la V2. Streaming retiré de la checklist d'activation.
</commit_message>
<xml_diff>
--- a/docs/Documentation_Socle_Agentique_V3.docx
+++ b/docs/Documentation_Socle_Agentique_V3.docx
@@ -3842,6 +3842,29 @@
     </w:p>
     <w:p>
       <w:pPr>
+        <w:pStyle w:val="ListBullet"/>
+      </w:pPr>
+      <w:r>
+        <w:rPr>
+          <w:b/>
+          <w:i w:val="0"/>
+          <w:color w:val="EA5B13"/>
+          <w:sz w:val="22"/>
+        </w:rPr>
+        <w:t xml:space="preserve">Vrai streaming token-par-token — </w:t>
+      </w:r>
+      <w:r>
+        <w:rPr>
+          <w:b w:val="0"/>
+          <w:i w:val="0"/>
+          <w:color w:val="1F1F1F"/>
+          <w:sz w:val="22"/>
+        </w:rPr>
+        <w:t>Orchestrateur.traiter_stream streame les fragments de l'agent avec garde-fou de sortie phrase par phrase, puis enrichissement + événement final. Mutualisé dans application/flux.py. L'UI web a un affichage progressif identique à la V2.</w:t>
+      </w:r>
+    </w:p>
+    <w:p>
+      <w:pPr>
         <w:spacing w:after="120"/>
       </w:pPr>
       <w:r>
@@ -3875,29 +3898,6 @@
           <w:sz w:val="22"/>
         </w:rPr>
         <w:t>seul l'exact-match est branché (le sémantique nécessite le port embeddings).</w:t>
-      </w:r>
-    </w:p>
-    <w:p>
-      <w:pPr>
-        <w:pStyle w:val="ListBullet"/>
-      </w:pPr>
-      <w:r>
-        <w:rPr>
-          <w:b/>
-          <w:i w:val="0"/>
-          <w:color w:val="EA5B13"/>
-          <w:sz w:val="22"/>
-        </w:rPr>
-        <w:t xml:space="preserve">Vrai streaming — </w:t>
-      </w:r>
-      <w:r>
-        <w:rPr>
-          <w:b w:val="0"/>
-          <w:i w:val="0"/>
-          <w:color w:val="1F1F1F"/>
-          <w:sz w:val="22"/>
-        </w:rPr>
-        <w:t>l'adaptateur émet la réponse en un bloc après génération complète. Pour l'UX, streamer token par token.</w:t>
       </w:r>
     </w:p>
     <w:p>

</xml_diff>

<commit_message>
docs(agentique): documenter le dialogue consultatif (plantation, localité en premier) dans le cours Word
</commit_message>
<xml_diff>
--- a/docs/Documentation_Socle_Agentique_V3.docx
+++ b/docs/Documentation_Socle_Agentique_V3.docx
@@ -813,6 +813,47 @@
           </w:p>
         </w:tc>
       </w:tr>
+      <w:tr>
+        <w:tc>
+          <w:tcPr>
+            <w:tcW w:type="dxa" w:w="2880"/>
+          </w:tcPr>
+          <w:p>
+            <w:r>
+              <w:rPr>
+                <w:sz w:val="18"/>
+              </w:rPr>
+              <w:t>Adaptateurs</w:t>
+            </w:r>
+          </w:p>
+        </w:tc>
+        <w:tc>
+          <w:tcPr>
+            <w:tcW w:type="dxa" w:w="2880"/>
+          </w:tcPr>
+          <w:p>
+            <w:r>
+              <w:rPr>
+                <w:sz w:val="18"/>
+              </w:rPr>
+              <w:t>services/localites.py</w:t>
+            </w:r>
+          </w:p>
+        </w:tc>
+        <w:tc>
+          <w:tcPr>
+            <w:tcW w:type="dxa" w:w="2880"/>
+          </w:tcPr>
+          <w:p>
+            <w:r>
+              <w:rPr>
+                <w:sz w:val="18"/>
+              </w:rPr>
+              <w:t>Détection de localités ivoiriennes (zone cacaoyère / savane du Nord / Direction Régionale), partagée par l'agent Météo, l'annuaire contacts et les garde-fous.</w:t>
+            </w:r>
+          </w:p>
+        </w:tc>
+      </w:tr>
     </w:tbl>
     <w:p>
       <w:pPr>
@@ -1911,6 +1952,29 @@
           <w:color w:val="EA5B13"/>
           <w:sz w:val="22"/>
         </w:rPr>
+        <w:t xml:space="preserve">Clarification consultative : engager le dialogue plutôt que répondre à l'aveugle — </w:t>
+      </w:r>
+      <w:r>
+        <w:rPr>
+          <w:b w:val="0"/>
+          <w:i w:val="0"/>
+          <w:color w:val="1F1F1F"/>
+          <w:sz w:val="22"/>
+        </w:rPr>
+        <w:t>au 1er tour, si une bonne réponse dépend d'un contexte manquant, le système pose LUI-MÊME les questions (partie atteinte, surface, localité…) et ne répond qu'au tour suivant. Détection déterministe par thèmes (symptôme, traitement, rendement, fertilisation, plantation), motifs normalisés sans accents, UNE seule salve par conversation (dès qu'un historique existe, on répond). Pour une plantation à créer (« je veux planter des cacaoyers », semer, pépinière, créer/démarrer un champ), la localité est demandée EN PREMIER : variétés et calendrier dépendent d'abord de la zone. Déterministe = instantané (aucune inférence dépensée) et fiable même avec un petit modèle CPU (v0.6.61).</w:t>
+      </w:r>
+    </w:p>
+    <w:p>
+      <w:pPr>
+        <w:pStyle w:val="ListBullet"/>
+      </w:pPr>
+      <w:r>
+        <w:rPr>
+          <w:b/>
+          <w:i w:val="0"/>
+          <w:color w:val="EA5B13"/>
+          <w:sz w:val="22"/>
+        </w:rPr>
         <w:t xml:space="preserve">Défense en profondeur (entrée ET sortie) — </w:t>
       </w:r>
       <w:r>
@@ -2726,6 +2790,52 @@
     </w:p>
     <w:p>
       <w:pPr>
+        <w:pStyle w:val="ListBullet"/>
+      </w:pPr>
+      <w:r>
+        <w:rPr>
+          <w:b/>
+          <w:i w:val="0"/>
+          <w:color w:val="EA5B13"/>
+          <w:sz w:val="22"/>
+        </w:rPr>
+        <w:t xml:space="preserve">Détecter la localité, jamais la deviner — </w:t>
+      </w:r>
+      <w:r>
+        <w:rPr>
+          <w:b w:val="0"/>
+          <w:i w:val="0"/>
+          <w:color w:val="1F1F1F"/>
+          <w:sz w:val="22"/>
+        </w:rPr>
+        <w:t>une prévision n'a de sens que localisée. L'agent détecte la commune sur TOUT le fil (historique + dernier tour) via le module partagé localites (liste officielle des 60 zones ANADER, insensible casse/accents). Une ville citée plus tôt dans la conversation reste connue au tour suivant.</w:t>
+      </w:r>
+    </w:p>
+    <w:p>
+      <w:pPr>
+        <w:pStyle w:val="ListBullet"/>
+      </w:pPr>
+      <w:r>
+        <w:rPr>
+          <w:b/>
+          <w:i w:val="0"/>
+          <w:color w:val="EA5B13"/>
+          <w:sz w:val="22"/>
+        </w:rPr>
+        <w:t xml:space="preserve">Trois cas, aucune météo inventée — </w:t>
+      </w:r>
+      <w:r>
+        <w:rPr>
+          <w:b w:val="0"/>
+          <w:i w:val="0"/>
+          <w:color w:val="1F1F1F"/>
+          <w:sz w:val="22"/>
+        </w:rPr>
+        <w:t>localité cacaoyère → prévisions Open-Meteo ; localité de savane du Nord (Korhogo, Ferké… non cacaoyères) → on explique avec tact qu'elle n'est pas concernée par le cacao et on redirige, sans prévision ; aucune localité → on demande la commune. Plutôt qu'un centroïde pays inutile ou un chiffre fabriqué, une consigne explicite (même pattern de souveraineté que l'agent Prix sans cours).</w:t>
+      </w:r>
+    </w:p>
+    <w:p>
+      <w:pPr>
         <w:pStyle w:val="Heading3"/>
       </w:pPr>
       <w:r>
@@ -2747,7 +2857,7 @@
           <w:color w:val="EA5B13"/>
           <w:sz w:val="22"/>
         </w:rPr>
-        <w:t>➤ L'outil = les yeux et les mains de l'agent sur le monde réel. L'agent = le cerveau qui décide quoi en faire.</w:t>
+        <w:t>➤ L'outil = les yeux et les mains de l'agent sur le monde réel. L'agent = le cerveau qui décide quoi en faire — et qui sait DE QUEL endroit il parle, ou demande.</w:t>
       </w:r>
     </w:p>
     <w:p>
@@ -2772,7 +2882,7 @@
           <w:color w:val="606060"/>
           <w:sz w:val="20"/>
         </w:rPr>
-        <w:t>L'agent récupère puis injecte (extrait) :</w:t>
+        <w:t>L'agent localise, puis injecte des faits OU une consigne (extrait) :</w:t>
       </w:r>
     </w:p>
     <w:p>
@@ -2789,7 +2899,7 @@
           <w:color w:val="1F1F1F"/>
           <w:sz w:val="18"/>
         </w:rPr>
-        <w:t>async def traiter(self, requete) -&gt; AgentReponse:</w:t>
+        <w:t>async def _contexte(self, requete) -&gt; str | None:</w:t>
       </w:r>
       <w:r>
         <w:rPr>
@@ -2800,7 +2910,7 @@
           <w:sz w:val="18"/>
         </w:rPr>
         <w:br/>
-        <w:t xml:space="preserve">    localite = _detecter_localite(requete.fil_ancre) or self._geo_defaut</w:t>
+        <w:t xml:space="preserve">    texte = _fil_complet(requete)                  # historique user + dernier tour</w:t>
       </w:r>
       <w:r>
         <w:rPr>
@@ -2811,7 +2921,7 @@
           <w:sz w:val="18"/>
         </w:rPr>
         <w:br/>
-        <w:t xml:space="preserve">    previsions = await self._outil.invoquer(localite=localite)  # tool use</w:t>
+        <w:t xml:space="preserve">    if (ville := localites.detecter(texte)):        # localité CACAOYÈRE ?</w:t>
       </w:r>
       <w:r>
         <w:rPr>
@@ -2822,7 +2932,7 @@
           <w:sz w:val="18"/>
         </w:rPr>
         <w:br/>
-        <w:t xml:space="preserve">    contexte = _formater_previsions(localite, previsions)</w:t>
+        <w:t xml:space="preserve">        prev = await self._outil.invoquer(localite=ville)    # tool use</w:t>
       </w:r>
       <w:r>
         <w:rPr>
@@ -2833,389 +2943,8 @@
           <w:sz w:val="18"/>
         </w:rPr>
         <w:br/>
-        <w:t xml:space="preserve">    return await self._generer(requete, contexte)  # le LLM raisonne sur les faits</w:t>
-      </w:r>
-    </w:p>
-    <w:p>
-      <w:pPr>
-        <w:pStyle w:val="Heading3"/>
-      </w:pPr>
-      <w:r>
-        <w:rPr>
-          <w:color w:val="EA5B13"/>
-        </w:rPr>
-        <w:t>Ce que les tests verrouillent</w:t>
-      </w:r>
-    </w:p>
-    <w:p>
-      <w:pPr>
-        <w:pStyle w:val="ListBullet"/>
-      </w:pPr>
-      <w:r>
-        <w:rPr>
-          <w:b w:val="0"/>
-          <w:i w:val="0"/>
-          <w:color w:val="1F1F1F"/>
-          <w:sz w:val="22"/>
-        </w:rPr>
-        <w:t>Score élevé sur une question météo, quasi nul sur une question prix.</w:t>
-      </w:r>
-    </w:p>
-    <w:p>
-      <w:pPr>
-        <w:pStyle w:val="ListBullet"/>
-      </w:pPr>
-      <w:r>
-        <w:rPr>
-          <w:b w:val="0"/>
-          <w:i w:val="0"/>
-          <w:color w:val="1F1F1F"/>
-          <w:sz w:val="22"/>
-        </w:rPr>
-        <w:t>Les prévisions récupérées sont bien injectées dans le contexte passé au LLM.</w:t>
-      </w:r>
-    </w:p>
-    <w:p>
-      <w:r>
-        <w:br w:type="page"/>
-      </w:r>
-    </w:p>
-    <w:p>
-      <w:pPr>
-        <w:pStyle w:val="Heading1"/>
-      </w:pPr>
-      <w:r>
-        <w:rPr>
-          <w:color w:val="EA5B13"/>
-        </w:rPr>
-        <w:t>7. Réplication du pattern — services/outils/prix.py + agent_prix.py</w:t>
-      </w:r>
-    </w:p>
-    <w:p>
-      <w:pPr>
-        <w:pStyle w:val="Heading3"/>
-      </w:pPr>
-      <w:r>
-        <w:rPr>
-          <w:color w:val="EA5B13"/>
-        </w:rPr>
-        <w:t>Le concept</w:t>
-      </w:r>
-    </w:p>
-    <w:p>
-      <w:pPr>
-        <w:spacing w:after="120"/>
-      </w:pPr>
-      <w:r>
-        <w:rPr>
-          <w:b w:val="0"/>
-          <w:i w:val="0"/>
-          <w:color w:val="1F1F1F"/>
-          <w:sz w:val="22"/>
-        </w:rPr>
-        <w:t>L'agent Prix est le jumeau de l'agent Météo : même moule (outil + port mockable + injection de contexte), domaine différent (prix/marché du cacao). Sa valeur pédagogique : prouver que le framework tient.</w:t>
-      </w:r>
-    </w:p>
-    <w:p>
-      <w:pPr>
-        <w:pStyle w:val="Heading3"/>
-      </w:pPr>
-      <w:r>
-        <w:rPr>
-          <w:color w:val="EA5B13"/>
-        </w:rPr>
-        <w:t>Les décisions de conception</w:t>
-      </w:r>
-    </w:p>
-    <w:p>
-      <w:pPr>
-        <w:pStyle w:val="ListBullet"/>
-      </w:pPr>
-      <w:r>
-        <w:rPr>
-          <w:b/>
-          <w:i w:val="0"/>
-          <w:color w:val="EA5B13"/>
-          <w:sz w:val="22"/>
-        </w:rPr>
-        <w:t xml:space="preserve">Coût marginal faible et constant — </w:t>
-      </w:r>
-      <w:r>
-        <w:rPr>
-          <w:b w:val="0"/>
-          <w:i w:val="0"/>
-          <w:color w:val="1F1F1F"/>
-          <w:sz w:val="22"/>
-        </w:rPr>
-        <w:t>le test d'un bon socle : ajouter l'agent n°5..n°11 = recopier le moule en changeant le domaine.</w:t>
-      </w:r>
-    </w:p>
-    <w:p>
-      <w:pPr>
-        <w:pStyle w:val="ListBullet"/>
-      </w:pPr>
-      <w:r>
-        <w:rPr>
-          <w:b/>
-          <w:i w:val="0"/>
-          <w:color w:val="EA5B13"/>
-          <w:sz w:val="22"/>
-        </w:rPr>
-        <w:t xml:space="preserve">invoquer(**kwargs) absorbe la différence — </w:t>
-      </w:r>
-      <w:r>
-        <w:rPr>
-          <w:b w:val="0"/>
-          <w:i w:val="0"/>
-          <w:color w:val="1F1F1F"/>
-          <w:sz w:val="22"/>
-        </w:rPr>
-        <w:t>OutilMeteo prend localite, OutilPrix ne prend rien (prix national). Le contrat choisi en Task 1 paie ici.</w:t>
-      </w:r>
-    </w:p>
-    <w:p>
-      <w:pPr>
-        <w:pStyle w:val="Heading3"/>
-      </w:pPr>
-      <w:r>
-        <w:rPr>
-          <w:color w:val="EA5B13"/>
-        </w:rPr>
-        <w:t>Modèle mental</w:t>
-      </w:r>
-    </w:p>
-    <w:p>
-      <w:pPr>
-        <w:spacing w:after="160"/>
-        <w:ind w:left="240"/>
-      </w:pPr>
-      <w:r>
-        <w:rPr>
-          <w:b w:val="0"/>
-          <w:i/>
-          <w:color w:val="EA5B13"/>
-          <w:sz w:val="22"/>
-        </w:rPr>
-        <w:t>➤ Quand un 2e agent « tool use » se construit en recopiant le 1er, le framework est prouvé. Le reste de la roadmap (10+ agents) est mécanique.</w:t>
-      </w:r>
-    </w:p>
-    <w:p>
-      <w:pPr>
-        <w:pStyle w:val="Heading3"/>
-      </w:pPr>
-      <w:r>
-        <w:rPr>
-          <w:color w:val="EA5B13"/>
-        </w:rPr>
-        <w:t>Ce que les tests verrouillent</w:t>
-      </w:r>
-    </w:p>
-    <w:p>
-      <w:pPr>
-        <w:pStyle w:val="ListBullet"/>
-      </w:pPr>
-      <w:r>
-        <w:rPr>
-          <w:b w:val="0"/>
-          <w:i w:val="0"/>
-          <w:color w:val="1F1F1F"/>
-          <w:sz w:val="22"/>
-        </w:rPr>
-        <w:t>Score élevé sur une question prix, quasi nul sur une question de taille.</w:t>
-      </w:r>
-    </w:p>
-    <w:p>
-      <w:pPr>
-        <w:pStyle w:val="ListBullet"/>
-      </w:pPr>
-      <w:r>
-        <w:rPr>
-          <w:b w:val="0"/>
-          <w:i w:val="0"/>
-          <w:color w:val="1F1F1F"/>
-          <w:sz w:val="22"/>
-        </w:rPr>
-        <w:t>Le cours récupéré (1800 FCFA/kg) est injecté dans le contexte.</w:t>
-      </w:r>
-    </w:p>
-    <w:p>
-      <w:r>
-        <w:br w:type="page"/>
-      </w:r>
-    </w:p>
-    <w:p>
-      <w:pPr>
-        <w:pStyle w:val="Heading1"/>
-      </w:pPr>
-      <w:r>
-        <w:rPr>
-          <w:color w:val="EA5B13"/>
-        </w:rPr>
-        <w:t>8. Synthèse multi-agents — services/agents/agent_reporting.py</w:t>
-      </w:r>
-    </w:p>
-    <w:p>
-      <w:pPr>
-        <w:pStyle w:val="Heading3"/>
-      </w:pPr>
-      <w:r>
-        <w:rPr>
-          <w:color w:val="EA5B13"/>
-        </w:rPr>
-        <w:t>Le concept</w:t>
-      </w:r>
-    </w:p>
-    <w:p>
-      <w:pPr>
-        <w:spacing w:after="120"/>
-      </w:pPr>
-      <w:r>
-        <w:rPr>
-          <w:b w:val="0"/>
-          <w:i w:val="0"/>
-          <w:color w:val="1F1F1F"/>
-          <w:sz w:val="22"/>
-        </w:rPr>
-        <w:t>Jusqu'ici un seul agent répond. L'agent Reporting est différent : il compose la sortie de PLUSIEURS agents (RAG + Météo + Prix) en une synthèse narrative. C'est le premier pas vers l'orchestration multi-agents (plusieurs contributeurs), par opposition au simple routage vers UN agent. Germe des architectures « agent superviseur ».</w:t>
-      </w:r>
-    </w:p>
-    <w:p>
-      <w:pPr>
-        <w:pStyle w:val="Heading3"/>
-      </w:pPr>
-      <w:r>
-        <w:rPr>
-          <w:color w:val="EA5B13"/>
-        </w:rPr>
-        <w:t>Les décisions de conception</w:t>
-      </w:r>
-    </w:p>
-    <w:p>
-      <w:pPr>
-        <w:pStyle w:val="ListBullet"/>
-      </w:pPr>
-      <w:r>
-        <w:rPr>
-          <w:b/>
-          <w:i w:val="0"/>
-          <w:color w:val="EA5B13"/>
-          <w:sz w:val="22"/>
-        </w:rPr>
-        <w:t xml:space="preserve">Construit en dernier — </w:t>
-      </w:r>
-      <w:r>
-        <w:rPr>
-          <w:b w:val="0"/>
-          <w:i w:val="0"/>
-          <w:color w:val="1F1F1F"/>
-          <w:sz w:val="22"/>
-        </w:rPr>
-        <w:t>il dépend des autres : il illustre qu'un agent peut consommer le travail d'agents pairs.</w:t>
-      </w:r>
-    </w:p>
-    <w:p>
-      <w:pPr>
-        <w:pStyle w:val="ListBullet"/>
-      </w:pPr>
-      <w:r>
-        <w:rPr>
-          <w:b/>
-          <w:i w:val="0"/>
-          <w:color w:val="EA5B13"/>
-          <w:sz w:val="22"/>
-        </w:rPr>
-        <w:t xml:space="preserve">Agrégation prudente — </w:t>
-      </w:r>
-      <w:r>
-        <w:rPr>
-          <w:b w:val="0"/>
-          <w:i w:val="0"/>
-          <w:color w:val="1F1F1F"/>
-          <w:sz w:val="22"/>
-        </w:rPr>
-        <w:t>les sources des contributions sont unionnées sans doublon ; la confiance retenue est la plus basse (prudence).</w:t>
-      </w:r>
-    </w:p>
-    <w:p>
-      <w:pPr>
-        <w:pStyle w:val="ListBullet"/>
-      </w:pPr>
-      <w:r>
-        <w:rPr>
-          <w:b/>
-          <w:i w:val="0"/>
-          <w:color w:val="EA5B13"/>
-          <w:sz w:val="22"/>
-        </w:rPr>
-        <w:t xml:space="preserve">Fusion séquentielle simple — </w:t>
-      </w:r>
-      <w:r>
-        <w:rPr>
-          <w:b w:val="0"/>
-          <w:i w:val="0"/>
-          <w:color w:val="1F1F1F"/>
-          <w:sz w:val="22"/>
-        </w:rPr>
-        <w:t>la généralisation fan-out/fan-in (exécution parallèle pilotée par l'orchestrateur) est une évolution V3+ explicitement hors socle.</w:t>
-      </w:r>
-    </w:p>
-    <w:p>
-      <w:pPr>
-        <w:pStyle w:val="Heading3"/>
-      </w:pPr>
-      <w:r>
-        <w:rPr>
-          <w:color w:val="EA5B13"/>
-        </w:rPr>
-        <w:t>Modèle mental</w:t>
-      </w:r>
-    </w:p>
-    <w:p>
-      <w:pPr>
-        <w:spacing w:after="160"/>
-        <w:ind w:left="240"/>
-      </w:pPr>
-      <w:r>
-        <w:rPr>
-          <w:b w:val="0"/>
-          <w:i/>
-          <w:color w:val="EA5B13"/>
-          <w:sz w:val="22"/>
-        </w:rPr>
-        <w:t>➤ Le routage choisit QUI parle ; la synthèse fait PARLER ENSEMBLE. C'est la bascule du mono-agent vers le multi-agents.</w:t>
-      </w:r>
-    </w:p>
-    <w:p>
-      <w:pPr>
-        <w:pStyle w:val="Heading3"/>
-      </w:pPr>
-      <w:r>
-        <w:rPr>
-          <w:color w:val="EA5B13"/>
-        </w:rPr>
-        <w:t>Code</w:t>
-      </w:r>
-    </w:p>
-    <w:p>
-      <w:pPr>
-        <w:spacing w:after="40"/>
-      </w:pPr>
-      <w:r>
-        <w:rPr>
-          <w:b w:val="0"/>
-          <w:i/>
-          <w:color w:val="606060"/>
-          <w:sz w:val="20"/>
-        </w:rPr>
-        <w:t>synthetiser (extrait) :</w:t>
-      </w:r>
-    </w:p>
-    <w:p>
-      <w:pPr>
-        <w:spacing w:before="80" w:after="160"/>
-        <w:ind w:left="160"/>
-        <w:shd w:val="clear" w:fill="F2F2F2"/>
-      </w:pPr>
+        <w:t xml:space="preserve">        return _formater_previsions(ville, prev)    # le LLM raisonne sur les faits</w:t>
+      </w:r>
       <w:r>
         <w:rPr>
           <w:rFonts w:ascii="Consolas" w:hAnsi="Consolas"/>
@@ -3224,7 +2953,8 @@
           <w:color w:val="1F1F1F"/>
           <w:sz w:val="18"/>
         </w:rPr>
-        <w:t>async def synthetiser(self, requete, contributions: list[AgentReponse]) -&gt; AgentReponse:</w:t>
+        <w:br/>
+        <w:t xml:space="preserve">    if (nord := localites.detecter_nord(texte)):    # savane du Nord ?</w:t>
       </w:r>
       <w:r>
         <w:rPr>
@@ -3235,7 +2965,7 @@
           <w:sz w:val="18"/>
         </w:rPr>
         <w:br/>
-        <w:t xml:space="preserve">    contexte = _formater_contributions(contributions)   # « [meteo] … / [prix] … »</w:t>
+        <w:t xml:space="preserve">        return _consigne_nord(nord)                 # pas une zone cacao -&gt; redirection</w:t>
       </w:r>
       <w:r>
         <w:rPr>
@@ -3246,8 +2976,431 @@
           <w:sz w:val="18"/>
         </w:rPr>
         <w:br/>
-        <w:t xml:space="preserve">    base = await self._generer(requete, contexte)        # le LLM rédige la synthèse</w:t>
-      </w:r>
+        <w:t xml:space="preserve">    return _CONSIGNE_COMMUNE                         # aucune ville -&gt; demander la commune</w:t>
+      </w:r>
+    </w:p>
+    <w:p>
+      <w:pPr>
+        <w:pStyle w:val="Heading3"/>
+      </w:pPr>
+      <w:r>
+        <w:rPr>
+          <w:color w:val="EA5B13"/>
+        </w:rPr>
+        <w:t>Ce que les tests verrouillent</w:t>
+      </w:r>
+    </w:p>
+    <w:p>
+      <w:pPr>
+        <w:pStyle w:val="ListBullet"/>
+      </w:pPr>
+      <w:r>
+        <w:rPr>
+          <w:b w:val="0"/>
+          <w:i w:val="0"/>
+          <w:color w:val="1F1F1F"/>
+          <w:sz w:val="22"/>
+        </w:rPr>
+        <w:t>Score élevé sur une question météo, quasi nul sur une question prix.</w:t>
+      </w:r>
+    </w:p>
+    <w:p>
+      <w:pPr>
+        <w:pStyle w:val="ListBullet"/>
+      </w:pPr>
+      <w:r>
+        <w:rPr>
+          <w:b w:val="0"/>
+          <w:i w:val="0"/>
+          <w:color w:val="1F1F1F"/>
+          <w:sz w:val="22"/>
+        </w:rPr>
+        <w:t>Les prévisions récupérées sont bien injectées dans le contexte passé au LLM.</w:t>
+      </w:r>
+    </w:p>
+    <w:p>
+      <w:pPr>
+        <w:pStyle w:val="ListBullet"/>
+      </w:pPr>
+      <w:r>
+        <w:rPr>
+          <w:b w:val="0"/>
+          <w:i w:val="0"/>
+          <w:color w:val="1F1F1F"/>
+          <w:sz w:val="22"/>
+        </w:rPr>
+        <w:t>Une ville citée seulement dans l'historique est quand même détectée (mémoire du fil).</w:t>
+      </w:r>
+    </w:p>
+    <w:p>
+      <w:pPr>
+        <w:pStyle w:val="ListBullet"/>
+      </w:pPr>
+      <w:r>
+        <w:rPr>
+          <w:b w:val="0"/>
+          <w:i w:val="0"/>
+          <w:color w:val="1F1F1F"/>
+          <w:sz w:val="22"/>
+        </w:rPr>
+        <w:t>Une localité de savane du Nord déclenche la redirection « non cacaoyère », sans appel météo.</w:t>
+      </w:r>
+    </w:p>
+    <w:p>
+      <w:pPr>
+        <w:pStyle w:val="ListBullet"/>
+      </w:pPr>
+      <w:r>
+        <w:rPr>
+          <w:b w:val="0"/>
+          <w:i w:val="0"/>
+          <w:color w:val="1F1F1F"/>
+          <w:sz w:val="22"/>
+        </w:rPr>
+        <w:t>Sans localité, l'agent demande la commune et n'invente aucune donnée météo.</w:t>
+      </w:r>
+    </w:p>
+    <w:p>
+      <w:r>
+        <w:br w:type="page"/>
+      </w:r>
+    </w:p>
+    <w:p>
+      <w:pPr>
+        <w:pStyle w:val="Heading1"/>
+      </w:pPr>
+      <w:r>
+        <w:rPr>
+          <w:color w:val="EA5B13"/>
+        </w:rPr>
+        <w:t>7. Réplication du pattern — services/outils/prix.py + agent_prix.py</w:t>
+      </w:r>
+    </w:p>
+    <w:p>
+      <w:pPr>
+        <w:pStyle w:val="Heading3"/>
+      </w:pPr>
+      <w:r>
+        <w:rPr>
+          <w:color w:val="EA5B13"/>
+        </w:rPr>
+        <w:t>Le concept</w:t>
+      </w:r>
+    </w:p>
+    <w:p>
+      <w:pPr>
+        <w:spacing w:after="120"/>
+      </w:pPr>
+      <w:r>
+        <w:rPr>
+          <w:b w:val="0"/>
+          <w:i w:val="0"/>
+          <w:color w:val="1F1F1F"/>
+          <w:sz w:val="22"/>
+        </w:rPr>
+        <w:t>L'agent Prix est le jumeau de l'agent Météo : même moule (outil + port mockable + injection de contexte), domaine différent (prix/marché du cacao). Sa valeur pédagogique : prouver que le framework tient.</w:t>
+      </w:r>
+    </w:p>
+    <w:p>
+      <w:pPr>
+        <w:pStyle w:val="Heading3"/>
+      </w:pPr>
+      <w:r>
+        <w:rPr>
+          <w:color w:val="EA5B13"/>
+        </w:rPr>
+        <w:t>Les décisions de conception</w:t>
+      </w:r>
+    </w:p>
+    <w:p>
+      <w:pPr>
+        <w:pStyle w:val="ListBullet"/>
+      </w:pPr>
+      <w:r>
+        <w:rPr>
+          <w:b/>
+          <w:i w:val="0"/>
+          <w:color w:val="EA5B13"/>
+          <w:sz w:val="22"/>
+        </w:rPr>
+        <w:t xml:space="preserve">Coût marginal faible et constant — </w:t>
+      </w:r>
+      <w:r>
+        <w:rPr>
+          <w:b w:val="0"/>
+          <w:i w:val="0"/>
+          <w:color w:val="1F1F1F"/>
+          <w:sz w:val="22"/>
+        </w:rPr>
+        <w:t>le test d'un bon socle : ajouter l'agent n°5..n°11 = recopier le moule en changeant le domaine.</w:t>
+      </w:r>
+    </w:p>
+    <w:p>
+      <w:pPr>
+        <w:pStyle w:val="ListBullet"/>
+      </w:pPr>
+      <w:r>
+        <w:rPr>
+          <w:b/>
+          <w:i w:val="0"/>
+          <w:color w:val="EA5B13"/>
+          <w:sz w:val="22"/>
+        </w:rPr>
+        <w:t xml:space="preserve">invoquer(**kwargs) absorbe la différence — </w:t>
+      </w:r>
+      <w:r>
+        <w:rPr>
+          <w:b w:val="0"/>
+          <w:i w:val="0"/>
+          <w:color w:val="1F1F1F"/>
+          <w:sz w:val="22"/>
+        </w:rPr>
+        <w:t>OutilMeteo prend localite, OutilPrix ne prend rien (prix national). Le contrat choisi en Task 1 paie ici.</w:t>
+      </w:r>
+    </w:p>
+    <w:p>
+      <w:pPr>
+        <w:pStyle w:val="Heading3"/>
+      </w:pPr>
+      <w:r>
+        <w:rPr>
+          <w:color w:val="EA5B13"/>
+        </w:rPr>
+        <w:t>Modèle mental</w:t>
+      </w:r>
+    </w:p>
+    <w:p>
+      <w:pPr>
+        <w:spacing w:after="160"/>
+        <w:ind w:left="240"/>
+      </w:pPr>
+      <w:r>
+        <w:rPr>
+          <w:b w:val="0"/>
+          <w:i/>
+          <w:color w:val="EA5B13"/>
+          <w:sz w:val="22"/>
+        </w:rPr>
+        <w:t>➤ Quand un 2e agent « tool use » se construit en recopiant le 1er, le framework est prouvé. Le reste de la roadmap (10+ agents) est mécanique.</w:t>
+      </w:r>
+    </w:p>
+    <w:p>
+      <w:pPr>
+        <w:pStyle w:val="Heading3"/>
+      </w:pPr>
+      <w:r>
+        <w:rPr>
+          <w:color w:val="EA5B13"/>
+        </w:rPr>
+        <w:t>Ce que les tests verrouillent</w:t>
+      </w:r>
+    </w:p>
+    <w:p>
+      <w:pPr>
+        <w:pStyle w:val="ListBullet"/>
+      </w:pPr>
+      <w:r>
+        <w:rPr>
+          <w:b w:val="0"/>
+          <w:i w:val="0"/>
+          <w:color w:val="1F1F1F"/>
+          <w:sz w:val="22"/>
+        </w:rPr>
+        <w:t>Score élevé sur une question prix, quasi nul sur une question de taille.</w:t>
+      </w:r>
+    </w:p>
+    <w:p>
+      <w:pPr>
+        <w:pStyle w:val="ListBullet"/>
+      </w:pPr>
+      <w:r>
+        <w:rPr>
+          <w:b w:val="0"/>
+          <w:i w:val="0"/>
+          <w:color w:val="1F1F1F"/>
+          <w:sz w:val="22"/>
+        </w:rPr>
+        <w:t>Le cours récupéré (1800 FCFA/kg) est injecté dans le contexte.</w:t>
+      </w:r>
+    </w:p>
+    <w:p>
+      <w:r>
+        <w:br w:type="page"/>
+      </w:r>
+    </w:p>
+    <w:p>
+      <w:pPr>
+        <w:pStyle w:val="Heading1"/>
+      </w:pPr>
+      <w:r>
+        <w:rPr>
+          <w:color w:val="EA5B13"/>
+        </w:rPr>
+        <w:t>8. Synthèse multi-agents — services/agents/agent_reporting.py</w:t>
+      </w:r>
+    </w:p>
+    <w:p>
+      <w:pPr>
+        <w:pStyle w:val="Heading3"/>
+      </w:pPr>
+      <w:r>
+        <w:rPr>
+          <w:color w:val="EA5B13"/>
+        </w:rPr>
+        <w:t>Le concept</w:t>
+      </w:r>
+    </w:p>
+    <w:p>
+      <w:pPr>
+        <w:spacing w:after="120"/>
+      </w:pPr>
+      <w:r>
+        <w:rPr>
+          <w:b w:val="0"/>
+          <w:i w:val="0"/>
+          <w:color w:val="1F1F1F"/>
+          <w:sz w:val="22"/>
+        </w:rPr>
+        <w:t>Jusqu'ici un seul agent répond. L'agent Reporting est différent : il compose la sortie de PLUSIEURS agents (RAG + Météo + Prix) en une synthèse narrative. C'est le premier pas vers l'orchestration multi-agents (plusieurs contributeurs), par opposition au simple routage vers UN agent. Germe des architectures « agent superviseur ».</w:t>
+      </w:r>
+    </w:p>
+    <w:p>
+      <w:pPr>
+        <w:pStyle w:val="Heading3"/>
+      </w:pPr>
+      <w:r>
+        <w:rPr>
+          <w:color w:val="EA5B13"/>
+        </w:rPr>
+        <w:t>Les décisions de conception</w:t>
+      </w:r>
+    </w:p>
+    <w:p>
+      <w:pPr>
+        <w:pStyle w:val="ListBullet"/>
+      </w:pPr>
+      <w:r>
+        <w:rPr>
+          <w:b/>
+          <w:i w:val="0"/>
+          <w:color w:val="EA5B13"/>
+          <w:sz w:val="22"/>
+        </w:rPr>
+        <w:t xml:space="preserve">Construit en dernier — </w:t>
+      </w:r>
+      <w:r>
+        <w:rPr>
+          <w:b w:val="0"/>
+          <w:i w:val="0"/>
+          <w:color w:val="1F1F1F"/>
+          <w:sz w:val="22"/>
+        </w:rPr>
+        <w:t>il dépend des autres : il illustre qu'un agent peut consommer le travail d'agents pairs.</w:t>
+      </w:r>
+    </w:p>
+    <w:p>
+      <w:pPr>
+        <w:pStyle w:val="ListBullet"/>
+      </w:pPr>
+      <w:r>
+        <w:rPr>
+          <w:b/>
+          <w:i w:val="0"/>
+          <w:color w:val="EA5B13"/>
+          <w:sz w:val="22"/>
+        </w:rPr>
+        <w:t xml:space="preserve">Agrégation prudente — </w:t>
+      </w:r>
+      <w:r>
+        <w:rPr>
+          <w:b w:val="0"/>
+          <w:i w:val="0"/>
+          <w:color w:val="1F1F1F"/>
+          <w:sz w:val="22"/>
+        </w:rPr>
+        <w:t>les sources des contributions sont unionnées sans doublon ; la confiance retenue est la plus basse (prudence).</w:t>
+      </w:r>
+    </w:p>
+    <w:p>
+      <w:pPr>
+        <w:pStyle w:val="ListBullet"/>
+      </w:pPr>
+      <w:r>
+        <w:rPr>
+          <w:b/>
+          <w:i w:val="0"/>
+          <w:color w:val="EA5B13"/>
+          <w:sz w:val="22"/>
+        </w:rPr>
+        <w:t xml:space="preserve">Fan-out / fan-in branché (02/07) — </w:t>
+      </w:r>
+      <w:r>
+        <w:rPr>
+          <w:b w:val="0"/>
+          <w:i w:val="0"/>
+          <w:color w:val="1F1F1F"/>
+          <w:sz w:val="22"/>
+        </w:rPr>
+        <w:t>l'orchestrateur pilote désormais la composition : un agent synthétiseur présent au classement déclenche le fan-out (contributions plafonnées à MAX_CONTRIBUTEURS=2) puis le fan-in. Séquentiel (inférence CPU mono-requête). Réservé au flux /chat/stream avec premier octet immédiat (voir checklist). L'exécution parallèle reste une évolution ultérieure.</w:t>
+      </w:r>
+    </w:p>
+    <w:p>
+      <w:pPr>
+        <w:pStyle w:val="Heading3"/>
+      </w:pPr>
+      <w:r>
+        <w:rPr>
+          <w:color w:val="EA5B13"/>
+        </w:rPr>
+        <w:t>Modèle mental</w:t>
+      </w:r>
+    </w:p>
+    <w:p>
+      <w:pPr>
+        <w:spacing w:after="160"/>
+        <w:ind w:left="240"/>
+      </w:pPr>
+      <w:r>
+        <w:rPr>
+          <w:b w:val="0"/>
+          <w:i/>
+          <w:color w:val="EA5B13"/>
+          <w:sz w:val="22"/>
+        </w:rPr>
+        <w:t>➤ Le routage choisit QUI parle ; la synthèse fait PARLER ENSEMBLE. C'est la bascule du mono-agent vers le multi-agents.</w:t>
+      </w:r>
+    </w:p>
+    <w:p>
+      <w:pPr>
+        <w:pStyle w:val="Heading3"/>
+      </w:pPr>
+      <w:r>
+        <w:rPr>
+          <w:color w:val="EA5B13"/>
+        </w:rPr>
+        <w:t>Code</w:t>
+      </w:r>
+    </w:p>
+    <w:p>
+      <w:pPr>
+        <w:spacing w:after="40"/>
+      </w:pPr>
+      <w:r>
+        <w:rPr>
+          <w:b w:val="0"/>
+          <w:i/>
+          <w:color w:val="606060"/>
+          <w:sz w:val="20"/>
+        </w:rPr>
+        <w:t>synthetiser (extrait) :</w:t>
+      </w:r>
+    </w:p>
+    <w:p>
+      <w:pPr>
+        <w:spacing w:before="80" w:after="160"/>
+        <w:ind w:left="160"/>
+        <w:shd w:val="clear" w:fill="F2F2F2"/>
+      </w:pPr>
       <w:r>
         <w:rPr>
           <w:rFonts w:ascii="Consolas" w:hAnsi="Consolas"/>
@@ -3256,8 +3409,7 @@
           <w:color w:val="1F1F1F"/>
           <w:sz w:val="18"/>
         </w:rPr>
-        <w:br/>
-        <w:t xml:space="preserve">    return AgentReponse(base.texte, _agréger_sources(contributions),</w:t>
+        <w:t>async def synthetiser(self, requete, contributions: list[AgentReponse]) -&gt; AgentReponse:</w:t>
       </w:r>
       <w:r>
         <w:rPr>
@@ -3268,6 +3420,39 @@
           <w:sz w:val="18"/>
         </w:rPr>
         <w:br/>
+        <w:t xml:space="preserve">    contexte = _formater_contributions(contributions)   # « [meteo] … / [prix] … »</w:t>
+      </w:r>
+      <w:r>
+        <w:rPr>
+          <w:rFonts w:ascii="Consolas" w:hAnsi="Consolas"/>
+          <w:b w:val="0"/>
+          <w:i w:val="0"/>
+          <w:color w:val="1F1F1F"/>
+          <w:sz w:val="18"/>
+        </w:rPr>
+        <w:br/>
+        <w:t xml:space="preserve">    base = await self._generer(requete, contexte)        # le LLM rédige la synthèse</w:t>
+      </w:r>
+      <w:r>
+        <w:rPr>
+          <w:rFonts w:ascii="Consolas" w:hAnsi="Consolas"/>
+          <w:b w:val="0"/>
+          <w:i w:val="0"/>
+          <w:color w:val="1F1F1F"/>
+          <w:sz w:val="18"/>
+        </w:rPr>
+        <w:br/>
+        <w:t xml:space="preserve">    return AgentReponse(base.texte, _agréger_sources(contributions),</w:t>
+      </w:r>
+      <w:r>
+        <w:rPr>
+          <w:rFonts w:ascii="Consolas" w:hAnsi="Consolas"/>
+          <w:b w:val="0"/>
+          <w:i w:val="0"/>
+          <w:color w:val="1F1F1F"/>
+          <w:sz w:val="18"/>
+        </w:rPr>
+        <w:br/>
         <w:t xml:space="preserve">        _confiance_min(contributions) or base.confiance, agent="reporting")</w:t>
       </w:r>
     </w:p>
@@ -3456,7 +3641,7 @@
           <w:color w:val="EA5B13"/>
           <w:sz w:val="22"/>
         </w:rPr>
-        <w:t xml:space="preserve">Outils « indisponibles » — </w:t>
+        <w:t xml:space="preserve">Sources réelles branchées — </w:t>
       </w:r>
       <w:r>
         <w:rPr>
@@ -3465,7 +3650,7 @@
           <w:color w:val="1F1F1F"/>
           <w:sz w:val="22"/>
         </w:rPr>
-        <w:t>Météo/Prix sont enregistrés avec un adaptateur neutre ({}) tant qu'aucune API réelle n'est branchée ; l'agent dégrade en conseil générique. Le socle reste 100 % testable et déployable sans dépendance externe.</w:t>
+        <w:t>l'agent Météo interroge Open-Meteo (données factuelles, pas un LLM tiers) et l'agent Prix s'appuie sur le prix bord-champ officiel du Conseil Café-Cacao. Le port reste mockable : aucun appel réseau en test, dégradation propre si la source tombe.</w:t>
       </w:r>
     </w:p>
     <w:p>
@@ -3616,7 +3801,21 @@
           <w:color w:val="606060"/>
           <w:sz w:val="22"/>
         </w:rPr>
-        <w:t>AUCUNE autre modification. L'orchestrateur, le registre et le routeur sont restés intacts — preuve concrète d'« ouvert à l'extension, fermé à la modification ». Les agents suivants (Maladie, Satellite, Normes, ERP…) suivront le même moule.</w:t>
+        <w:t>AUCUNE autre modification. L'orchestrateur, le registre et le routeur sont restés intacts — preuve concrète d'« ouvert à l'extension, fermé à la modification ». Les agents suivants suivront le même moule.</w:t>
+      </w:r>
+    </w:p>
+    <w:p>
+      <w:pPr>
+        <w:spacing w:after="120"/>
+      </w:pPr>
+      <w:r>
+        <w:rPr>
+          <w:b w:val="0"/>
+          <w:i w:val="0"/>
+          <w:color w:val="1F1F1F"/>
+          <w:sz w:val="22"/>
+        </w:rPr>
+        <w:t>Agent n°6 — Normes : ajouté par la même recette (agent_normes.py). Il conseille sur les référentiels de durabilité et de qualité du cacao — certifications volontaires (Rainforest Alliance, Fairtrade, agriculture biologique), normes de qualité (ISO) et la norme régionale africaine ARS 1000. Frontière nette avec l'agent Réglementation, qui couvre l'accès marché contraignant (EUDR) : les mots-clés certification/durabilité ont été confiés à Normes (retirés de Réglementation) pour un routage sans ambiguïté. Même garde-fou de souveraineté que l'EUDR : sans document RAG, aucun critère, seuil, montant de prime ni date inventé — redirection vers l'organisme certificateur, la coopérative ou l'agent ANADER. Les agents avancés restants (Maladie, Satellite, ERP, AgroSense…) nécessitent des intégrations externes.</w:t>
       </w:r>
     </w:p>
     <w:p>
@@ -3724,7 +3923,7 @@
           <w:color w:val="1F1F1F"/>
           <w:sz w:val="22"/>
         </w:rPr>
-        <w:t>seuil CI (--cov-fail-under). Le socle a porté la suite à 508 tests verts.</w:t>
+        <w:t>seuil CI (--cov-fail-under). La suite compte 635 tests verts.</w:t>
       </w:r>
     </w:p>
     <w:p>
@@ -3763,7 +3962,7 @@
         <w:rPr>
           <w:color w:val="EA5B13"/>
         </w:rPr>
-        <w:t>Checklist d'activation (avant agents_enabled = ON)</w:t>
+        <w:t>État d'activation (agents activés en production)</w:t>
       </w:r>
     </w:p>
     <w:p>
@@ -3777,7 +3976,7 @@
           <w:color w:val="1F1F1F"/>
           <w:sz w:val="22"/>
         </w:rPr>
-        <w:t>Le socle est sûr et dormant (flag OFF, V2 inchangée). La parité fonctionnelle progresse ; état au 29/06/2026 :</w:t>
+        <w:t>La plateforme agentique est désormais ACTIVE en production (agents_enabled = ON depuis la v0.6.41 ; détection de localité de l'agent Météo livrée en v0.6.43). Le flag reste un interrupteur de repli instantané vers la V2. État au 05/07/2026 :</w:t>
       </w:r>
     </w:p>
     <w:p>
@@ -3874,7 +4073,7 @@
           <w:color w:val="EA5B13"/>
           <w:sz w:val="22"/>
         </w:rPr>
-        <w:t>Reste avant agents_enabled = ON :</w:t>
+        <w:t>Fait depuis l'activation :</w:t>
       </w:r>
     </w:p>
     <w:p>
@@ -3888,7 +4087,7 @@
           <w:color w:val="EA5B13"/>
           <w:sz w:val="22"/>
         </w:rPr>
-        <w:t xml:space="preserve">Cache sémantique — </w:t>
+        <w:t xml:space="preserve">Sources météo/prix réelles — </w:t>
       </w:r>
       <w:r>
         <w:rPr>
@@ -3897,7 +4096,7 @@
           <w:color w:val="1F1F1F"/>
           <w:sz w:val="22"/>
         </w:rPr>
-        <w:t>seul l'exact-match est branché (le sémantique nécessite le port embeddings).</w:t>
+        <w:t>agent Météo branché sur Open-Meteo (géocodage + précipitations) ; agent Prix sur le prix bord-champ officiel du Conseil Café-Cacao, complété par le RAG (mise à marché, historique).</w:t>
       </w:r>
     </w:p>
     <w:p>
@@ -3911,7 +4110,7 @@
           <w:color w:val="EA5B13"/>
           <w:sz w:val="22"/>
         </w:rPr>
-        <w:t xml:space="preserve">Sources météo/prix réelles — </w:t>
+        <w:t xml:space="preserve">Détection de localité robuste — </w:t>
       </w:r>
       <w:r>
         <w:rPr>
@@ -3920,7 +4119,21 @@
           <w:color w:val="1F1F1F"/>
           <w:sz w:val="22"/>
         </w:rPr>
-        <w:t>remplacer MeteoIndisponible/PrixIndisponible par des adaptateurs httpx (port mockable) avant que les agents Météo/Prix apportent une valeur.</w:t>
+        <w:t>l'agent Météo détecte la commune sur tout le fil (module localites) et distingue zone cacaoyère / savane du Nord / commune absente, sans jamais fabriquer de météo (v0.6.43).</w:t>
+      </w:r>
+    </w:p>
+    <w:p>
+      <w:pPr>
+        <w:spacing w:after="120"/>
+      </w:pPr>
+      <w:r>
+        <w:rPr>
+          <w:b w:val="0"/>
+          <w:i w:val="0"/>
+          <w:color w:val="EA5B13"/>
+          <w:sz w:val="22"/>
+        </w:rPr>
+        <w:t>Fait depuis (02/07) :</w:t>
       </w:r>
     </w:p>
     <w:p>
@@ -3943,7 +4156,67 @@
           <w:color w:val="1F1F1F"/>
           <w:sz w:val="22"/>
         </w:rPr>
-        <w:t>AgentReporting.synthetiser n'est pas encore branché dans l'orchestrateur (dispatch mono-agent). La synthèse fan-out/fan-in est une évolution V3+.</w:t>
+        <w:t>AgentReporting.synthetiser branché dans l'orchestrateur. Déclencheur : présence d'un synthétiseur (hasattr synthetiser_stream) au classement → fan-out (plafonné) + fan-in. Réservé au flux /chat/stream : une composition = ~3 générations CPU (~3 min) dépasserait le time-out edge Cloudflare (~100 s) → 524 sur une réponse synchrone (vécu et corrigé). Le flux émet un événement « progress » immédiat (premier octet &lt; 1 s, ignoré par le front) + heartbeat par contribution, puis streame la synthèse token par token (synthetiser_stream + agreger). En synchrone /chat, repli mono-agent.</w:t>
+      </w:r>
+    </w:p>
+    <w:p>
+      <w:pPr>
+        <w:pStyle w:val="ListBullet"/>
+      </w:pPr>
+      <w:r>
+        <w:rPr>
+          <w:b/>
+          <w:i w:val="0"/>
+          <w:color w:val="EA5B13"/>
+          <w:sz w:val="22"/>
+        </w:rPr>
+        <w:t xml:space="preserve">Cache sémantique dans l'orchestrateur — </w:t>
+      </w:r>
+      <w:r>
+        <w:rPr>
+          <w:b w:val="0"/>
+          <w:i w:val="0"/>
+          <w:color w:val="1F1F1F"/>
+          <w:sz w:val="22"/>
+        </w:rPr>
+        <w:t>branché (parité V2) : après un miss exact (tour unique), on vectorise la question et on sert un voisin proche (cosinus &gt;= seuil) validé par un garde-fou lexical. Logique extraite dans application/cache_semantique.py (CacheSemantique), PARTAGÉE par ConseilService (V2) et l'orchestrateur (V3) — une seule source de vérité. Inerte si le service d'embeddings est absent.</w:t>
+      </w:r>
+    </w:p>
+    <w:p>
+      <w:pPr>
+        <w:spacing w:after="120"/>
+      </w:pPr>
+      <w:r>
+        <w:rPr>
+          <w:b w:val="0"/>
+          <w:i w:val="0"/>
+          <w:color w:val="EA5B13"/>
+          <w:sz w:val="22"/>
+        </w:rPr>
+        <w:t>Fait depuis (05/07) :</w:t>
+      </w:r>
+    </w:p>
+    <w:p>
+      <w:pPr>
+        <w:pStyle w:val="ListBullet"/>
+      </w:pPr>
+      <w:r>
+        <w:rPr>
+          <w:b/>
+          <w:i w:val="0"/>
+          <w:color w:val="EA5B13"/>
+          <w:sz w:val="22"/>
+        </w:rPr>
+        <w:t xml:space="preserve">Dialogue consultatif élargi au projet de plantation — </w:t>
+      </w:r>
+      <w:r>
+        <w:rPr>
+          <w:b w:val="0"/>
+          <w:i w:val="0"/>
+          <w:color w:val="1F1F1F"/>
+          <w:sz w:val="22"/>
+        </w:rPr>
+        <w:t>« je veux planter des cacaoyers » (et planter, semer, pépinière, créer/démarrer un champ) déclenche désormais la salve de clarification au lieu d'une réponse à l'aveugle, avec la LOCALITÉ en première question (variétés et calendrier dépendent d'abord de la zone). Vérifié de bout en bout en production (v0.6.61) : au tour 2, « Je suis à Soubré, sol argileux » fait remonter par le RAG l'étude pédologique ANADER de la zone (Krohon/Koda : couches indurées dès 60 cm, ombrière de 2 m) — la réponse est ancrée sur des documents sources, pas fabriquée.</w:t>
       </w:r>
     </w:p>
     <w:p>
@@ -4284,6 +4557,34 @@
                 <w:sz w:val="18"/>
               </w:rPr>
               <w:t>Choix du/des agent(s) pertinent(s) pour une requête (ici par score déterministe).</w:t>
+            </w:r>
+          </w:p>
+        </w:tc>
+      </w:tr>
+      <w:tr>
+        <w:tc>
+          <w:tcPr>
+            <w:tcW w:type="dxa" w:w="4320"/>
+          </w:tcPr>
+          <w:p>
+            <w:r>
+              <w:rPr>
+                <w:sz w:val="18"/>
+              </w:rPr>
+              <w:t>Clarification consultative (slot filling)</w:t>
+            </w:r>
+          </w:p>
+        </w:tc>
+        <w:tc>
+          <w:tcPr>
+            <w:tcW w:type="dxa" w:w="4320"/>
+          </w:tcPr>
+          <w:p>
+            <w:r>
+              <w:rPr>
+                <w:sz w:val="18"/>
+              </w:rPr>
+              <w:t>Collecte du contexte manquant (localité, surface, symptôme…) par des questions posées AVANT de répondre ; la réponse n'est produite qu'une fois les « cases » remplies.</w:t>
             </w:r>
           </w:p>
         </w:tc>

</xml_diff>

<commit_message>
docs(agents): documenter l'agent Satellite (A8) — cours markdown + Word
</commit_message>
<xml_diff>
--- a/docs/Documentation_Socle_Agentique_V3.docx
+++ b/docs/Documentation_Socle_Agentique_V3.docx
@@ -3815,7 +3815,21 @@
           <w:color w:val="1F1F1F"/>
           <w:sz w:val="22"/>
         </w:rPr>
-        <w:t>Agent n°6 — Normes : ajouté par la même recette (agent_normes.py). Il conseille sur les référentiels de durabilité et de qualité du cacao — certifications volontaires (Rainforest Alliance, Fairtrade, agriculture biologique), normes de qualité (ISO) et la norme régionale africaine ARS 1000. Frontière nette avec l'agent Réglementation, qui couvre l'accès marché contraignant (EUDR) : les mots-clés certification/durabilité ont été confiés à Normes (retirés de Réglementation) pour un routage sans ambiguïté. Même garde-fou de souveraineté que l'EUDR : sans document RAG, aucun critère, seuil, montant de prime ni date inventé — redirection vers l'organisme certificateur, la coopérative ou l'agent ANADER. Les agents avancés restants (Maladie, Satellite, ERP, AgroSense…) nécessitent des intégrations externes.</w:t>
+        <w:t>Agent n°6 — Normes : ajouté par la même recette (agent_normes.py). Il conseille sur les référentiels de durabilité et de qualité du cacao — certifications volontaires (Rainforest Alliance, Fairtrade, agriculture biologique), normes de qualité (ISO) et la norme régionale africaine ARS 1000. Frontière nette avec l'agent Réglementation, qui couvre l'accès marché contraignant (EUDR) : les mots-clés certification/durabilité ont été confiés à Normes (retirés de Réglementation) pour un routage sans ambiguïté. Même garde-fou de souveraineté que l'EUDR : sans document RAG, aucun critère, seuil, montant de prime ni date inventé — redirection vers l'organisme certificateur, la coopérative ou l'agent ANADER.</w:t>
+      </w:r>
+    </w:p>
+    <w:p>
+      <w:pPr>
+        <w:spacing w:after="120"/>
+      </w:pPr>
+      <w:r>
+        <w:rPr>
+          <w:b w:val="0"/>
+          <w:i w:val="0"/>
+          <w:color w:val="1F1F1F"/>
+          <w:sz w:val="22"/>
+        </w:rPr>
+        <w:t>Agent n°7 — Satellite (A8, 05/07/2026) : premier agent à INTÉGRATION EXTERNE, toujours par la même recette (agent_satellite.py + outil satellite.py/satellite_gfw.py). Il constate les alertes de déforestation Global Forest Watch (alertes intégrées GLAD+RADD) autour de la position du producteur — GPS trouvé dans le fil (borné Côte d'Ivoire) prioritaire, sinon localité nommée géocodée, sinon demande de position — sur un tampon d'environ 1 km, et croise ces faits datés au contexte RAG EUDR. Souveraineté renforcée : l'agent CONSTATE, il ne certifie JAMAIS une conformité (réserve injectée dans chaque contexte) ; sans clé GFW_API_KEY (Secret K8s, expire le 30/06/2027) la source est neutre → consigne explicite, aucun statut inventé. Frontière de routage : déforestation/géolocalisation confiés à Satellite (retirés de Réglementation, comme certification→Normes), verrouillée par un test discriminant. Source validée sur données réelles avant d'écrire le code : couverture ivoirienne discriminante (0 alerte en ville, 1 055 en lisière du parc de Taï), fraîcheur ~2 semaines, latence ~3 s ; particularités d'API encodées (redirection 307, GROUP BY au lieu de MAX(), alias SQL ignorés). Les agents avancés restants (Maladie, ERP, AgroSense) nécessitent d'autres intégrations externes.</w:t>
       </w:r>
     </w:p>
     <w:p>

</xml_diff>